<commit_message>
Update Evidence and BlazorWebApp-ContainerSupport-Validation.docx
</commit_message>
<xml_diff>
--- a/Evidence/BlazorWebApp-ContainerSupport-Validation.docx
+++ b/Evidence/BlazorWebApp-ContainerSupport-Validation.docx
@@ -82,8 +82,13 @@
         </w:numPr>
       </w:pPr>
       <w:r>
-        <w:t>Interactive WebAssembly</w:t>
-      </w:r>
+        <w:t xml:space="preserve">Interactive </w:t>
+      </w:r>
+      <w:proofErr w:type="spellStart"/>
+      <w:r>
+        <w:t>WebAssembly</w:t>
+      </w:r>
+      <w:proofErr w:type="spellEnd"/>
     </w:p>
     <w:p>
       <w:pPr>
@@ -287,10 +292,10 @@
         <w:tblDescription w:val=""/>
       </w:tblPr>
       <w:tblGrid>
-        <w:gridCol w:w="380"/>
-        <w:gridCol w:w="944"/>
-        <w:gridCol w:w="4476"/>
-        <w:gridCol w:w="3540"/>
+        <w:gridCol w:w="466"/>
+        <w:gridCol w:w="1249"/>
+        <w:gridCol w:w="2773"/>
+        <w:gridCol w:w="4852"/>
       </w:tblGrid>
       <w:tr>
         <w:tc>
@@ -445,11 +450,11 @@
           </w:tcPr>
           <w:p>
             <w:r>
-              <w:t xml:space="preserve">The creation dialog offers Enable </w:t>
+              <w:t xml:space="preserve">The creation dialog offers Enable container </w:t>
             </w:r>
             <w:r>
               <w:lastRenderedPageBreak/>
-              <w:t>container support for the Blazor Web App template, in the same place as for other ASP.NET Core templates.</w:t>
+              <w:t>support for the Blazor Web App template, in the same place as for other ASP.NET Core templates.</w:t>
             </w:r>
           </w:p>
         </w:tc>
@@ -488,8 +493,8 @@
               <w:tblDescription w:val=""/>
             </w:tblPr>
             <w:tblGrid>
-              <w:gridCol w:w="1229"/>
-              <w:gridCol w:w="3067"/>
+              <w:gridCol w:w="771"/>
+              <w:gridCol w:w="1822"/>
             </w:tblGrid>
             <w:tr>
               <w:tc>
@@ -568,6 +573,7 @@
                 </w:tcPr>
                 <w:p>
                   <w:r>
+                    <w:lastRenderedPageBreak/>
                     <w:t>Static SSR</w:t>
                   </w:r>
                 </w:p>
@@ -616,7 +622,6 @@
                 </w:tcPr>
                 <w:p>
                   <w:r>
-                    <w:lastRenderedPageBreak/>
                     <w:t>Interactive Server</w:t>
                   </w:r>
                 </w:p>
@@ -701,20 +706,21 @@
                       <w:b/>
                       <w:bCs/>
                     </w:rPr>
-                    <w:t>Failure Details</w:t>
-                  </w:r>
-                  <w:r>
-                    <w:rPr>
-                      <w:b/>
-                      <w:bCs/>
-                    </w:rPr>
-                    <w:t>:</w:t>
+                    <w:t>Failure Details:</w:t>
                   </w:r>
                   <w:r>
                     <w:br/>
                   </w:r>
                   <w:r>
-                    <w:t>While creating an interactive WebAssembly app with container support, we faced the following issue:</w:t>
+                    <w:t xml:space="preserve">While creating an interactive </w:t>
+                  </w:r>
+                  <w:proofErr w:type="spellStart"/>
+                  <w:r>
+                    <w:t>WebAssembly</w:t>
+                  </w:r>
+                  <w:proofErr w:type="spellEnd"/>
+                  <w:r>
+                    <w:t xml:space="preserve"> app with container support, we faced the following issue:</w:t>
                   </w:r>
                 </w:p>
                 <w:p>
@@ -723,7 +729,7 @@
                       <w:noProof/>
                     </w:rPr>
                     <w:drawing>
-                      <wp:inline distT="0" distB="0" distL="0" distR="0" wp14:anchorId="55B94808" wp14:editId="145BDD43">
+                      <wp:inline distT="0" distB="0" distL="0" distR="0" wp14:anchorId="55B94808" wp14:editId="3B6EF2FE">
                         <wp:extent cx="1447800" cy="584200"/>
                         <wp:effectExtent l="0" t="0" r="0" b="6350"/>
                         <wp:docPr id="1233292158" name="Picture 26"/>
@@ -854,8 +860,9 @@
                     <w:rPr>
                       <w:noProof/>
                     </w:rPr>
+                    <w:lastRenderedPageBreak/>
                     <w:drawing>
-                      <wp:inline distT="0" distB="0" distL="0" distR="0" wp14:anchorId="400D36D8" wp14:editId="62F60CF4">
+                      <wp:inline distT="0" distB="0" distL="0" distR="0" wp14:anchorId="400D36D8" wp14:editId="5889D9A2">
                         <wp:extent cx="1879600" cy="704850"/>
                         <wp:effectExtent l="0" t="0" r="6350" b="0"/>
                         <wp:docPr id="1143665754" name="Picture 25"/>
@@ -937,14 +944,35 @@
                 <w:rPr>
                   <w:rStyle w:val="Hyperlink"/>
                 </w:rPr>
-                <w:t xml:space="preserve">BlazorWebApp-ContainerSupport-Validation/Evidence/ContainerSupport-On-CreationDialog/blazor-creation-dialog.zip at main · </w:t>
+                <w:t>BlazorWebApp-ContainerSupport-Validation/Evidence/ContainerSupport-On-CreationDialog/blazor-creation-dialog.zip at main · BharatRamsf3693/</w:t>
               </w:r>
+              <w:proofErr w:type="spellStart"/>
               <w:r>
                 <w:rPr>
                   <w:rStyle w:val="Hyperlink"/>
                 </w:rPr>
-                <w:lastRenderedPageBreak/>
-                <w:t>BharatRamsf3693/BlazorWebApp-ContainerSupport-Validation</w:t>
+                <w:t>BlazorWebApp</w:t>
+              </w:r>
+              <w:proofErr w:type="spellEnd"/>
+              <w:r>
+                <w:rPr>
+                  <w:rStyle w:val="Hyperlink"/>
+                </w:rPr>
+                <w:t>-</w:t>
+              </w:r>
+              <w:proofErr w:type="spellStart"/>
+              <w:r>
+                <w:rPr>
+                  <w:rStyle w:val="Hyperlink"/>
+                </w:rPr>
+                <w:t>ContainerSupport</w:t>
+              </w:r>
+              <w:proofErr w:type="spellEnd"/>
+              <w:r>
+                <w:rPr>
+                  <w:rStyle w:val="Hyperlink"/>
+                </w:rPr>
+                <w:t>-Validation</w:t>
               </w:r>
             </w:hyperlink>
           </w:p>
@@ -994,11 +1022,15 @@
           </w:tcPr>
           <w:p>
             <w:r>
-              <w:t xml:space="preserve">All four apps build a container image </w:t>
+              <w:t xml:space="preserve">All four apps build a container image and run in it with no manual edits to the </w:t>
             </w:r>
+            <w:proofErr w:type="spellStart"/>
             <w:r>
-              <w:lastRenderedPageBreak/>
-              <w:t>and run in it with no manual edits to the Dockerfile or the project files.</w:t>
+              <w:t>Dockerfile</w:t>
+            </w:r>
+            <w:proofErr w:type="spellEnd"/>
+            <w:r>
+              <w:t xml:space="preserve"> or the project files.</w:t>
             </w:r>
           </w:p>
         </w:tc>
@@ -1037,9 +1069,9 @@
               <w:tblDescription w:val=""/>
             </w:tblPr>
             <w:tblGrid>
-              <w:gridCol w:w="603"/>
-              <w:gridCol w:w="3090"/>
-              <w:gridCol w:w="603"/>
+              <w:gridCol w:w="938"/>
+              <w:gridCol w:w="719"/>
+              <w:gridCol w:w="936"/>
             </w:tblGrid>
             <w:tr>
               <w:tc>
@@ -1065,7 +1097,6 @@
                       <w:b/>
                       <w:bCs/>
                     </w:rPr>
-                    <w:lastRenderedPageBreak/>
                     <w:t>Blazor Web App</w:t>
                   </w:r>
                 </w:p>
@@ -1120,15 +1151,7 @@
                       <w:b/>
                       <w:bCs/>
                     </w:rPr>
-                    <w:t>Visual Studio 202</w:t>
-                  </w:r>
-                  <w:r>
-                    <w:rPr>
-                      <w:b/>
-                      <w:bCs/>
-                    </w:rPr>
-                    <w:lastRenderedPageBreak/>
-                    <w:t>6 Insider Container Launch</w:t>
+                    <w:t>Visual Studio 2026 Insider Container Launch</w:t>
                   </w:r>
                 </w:p>
               </w:tc>
@@ -1153,7 +1176,6 @@
                 </w:tcPr>
                 <w:p>
                   <w:r>
-                    <w:lastRenderedPageBreak/>
                     <w:t>Static SSR</w:t>
                   </w:r>
                 </w:p>
@@ -1319,167 +1341,11 @@
                 </w:tcPr>
                 <w:p>
                   <w:r>
-                    <w:t>Fail</w:t>
-                  </w:r>
-                  <w:r>
-                    <w:br/>
-                  </w:r>
-                  <w:r>
-                    <w:br/>
-                  </w:r>
-                  <w:r>
-                    <w:rPr>
-                      <w:b/>
-                      <w:bCs/>
-                    </w:rPr>
-                    <w:t>Failure Details:</w:t>
+                    <w:t>Pass</w:t>
                   </w:r>
                 </w:p>
                 <w:p>
-                  <w:pPr>
-                    <w:numPr>
-                      <w:ilvl w:val="1"/>
-                      <w:numId w:val="9"/>
-                    </w:numPr>
-                  </w:pPr>
-                  <w:r>
-                    <w:t>The following issue was faced while creating the Docker image:</w:t>
-                  </w:r>
-                  <w:r>
-                    <w:br/>
-                    <w:t> </w:t>
-                  </w:r>
-                </w:p>
-                <w:p>
-                  <w:r>
-                    <w:rPr>
-                      <w:noProof/>
-                    </w:rPr>
-                    <w:lastRenderedPageBreak/>
-                    <w:drawing>
-                      <wp:inline distT="0" distB="0" distL="0" distR="0" wp14:anchorId="55FDD170" wp14:editId="1DC7886D">
-                        <wp:extent cx="4578350" cy="2362200"/>
-                        <wp:effectExtent l="0" t="0" r="0" b="0"/>
-                        <wp:docPr id="902318514" name="Picture 24"/>
-                        <wp:cNvGraphicFramePr>
-                          <a:graphicFrameLocks xmlns:a="http://schemas.openxmlformats.org/drawingml/2006/main" noChangeAspect="1"/>
-                        </wp:cNvGraphicFramePr>
-                        <a:graphic xmlns:a="http://schemas.openxmlformats.org/drawingml/2006/main">
-                          <a:graphicData uri="http://schemas.openxmlformats.org/drawingml/2006/picture">
-                            <pic:pic xmlns:pic="http://schemas.openxmlformats.org/drawingml/2006/picture">
-                              <pic:nvPicPr>
-                                <pic:cNvPr id="0" name="Picture 755"/>
-                                <pic:cNvPicPr>
-                                  <a:picLocks noChangeAspect="1" noChangeArrowheads="1"/>
-                                </pic:cNvPicPr>
-                              </pic:nvPicPr>
-                              <pic:blipFill>
-                                <a:blip r:embed="rId9" cstate="print">
-                                  <a:extLst>
-                                    <a:ext uri="{28A0092B-C50C-407E-A947-70E740481C1C}">
-                                      <a14:useLocalDpi xmlns:a14="http://schemas.microsoft.com/office/drawing/2010/main" val="0"/>
-                                    </a:ext>
-                                  </a:extLst>
-                                </a:blip>
-                                <a:srcRect/>
-                                <a:stretch>
-                                  <a:fillRect/>
-                                </a:stretch>
-                              </pic:blipFill>
-                              <pic:spPr bwMode="auto">
-                                <a:xfrm>
-                                  <a:off x="0" y="0"/>
-                                  <a:ext cx="4578350" cy="2362200"/>
-                                </a:xfrm>
-                                <a:prstGeom prst="rect">
-                                  <a:avLst/>
-                                </a:prstGeom>
-                                <a:noFill/>
-                                <a:ln>
-                                  <a:noFill/>
-                                </a:ln>
-                              </pic:spPr>
-                            </pic:pic>
-                          </a:graphicData>
-                        </a:graphic>
-                      </wp:inline>
-                    </w:drawing>
-                  </w:r>
-                </w:p>
-                <w:p>
-                  <w:r>
-                    <w:t> </w:t>
-                  </w:r>
-                </w:p>
-                <w:p>
-                  <w:pPr>
-                    <w:numPr>
-                      <w:ilvl w:val="1"/>
-                      <w:numId w:val="9"/>
-                    </w:numPr>
-                  </w:pPr>
-                  <w:r>
-                    <w:t>After moving the Dockerfile from the server project folder to the root folder of the project, the COPY path issue was fixed. The image was generated successfully, and it is running fine in the container.</w:t>
-                  </w:r>
-                </w:p>
-                <w:p>
-                  <w:r>
-                    <w:rPr>
-                      <w:noProof/>
-                    </w:rPr>
-                    <w:drawing>
-                      <wp:inline distT="0" distB="0" distL="0" distR="0" wp14:anchorId="05588EC8" wp14:editId="6B20C36D">
-                        <wp:extent cx="3937000" cy="1212850"/>
-                        <wp:effectExtent l="0" t="0" r="6350" b="6350"/>
-                        <wp:docPr id="1938277702" name="Picture 23"/>
-                        <wp:cNvGraphicFramePr>
-                          <a:graphicFrameLocks xmlns:a="http://schemas.openxmlformats.org/drawingml/2006/main" noChangeAspect="1"/>
-                        </wp:cNvGraphicFramePr>
-                        <a:graphic xmlns:a="http://schemas.openxmlformats.org/drawingml/2006/main">
-                          <a:graphicData uri="http://schemas.openxmlformats.org/drawingml/2006/picture">
-                            <pic:pic xmlns:pic="http://schemas.openxmlformats.org/drawingml/2006/picture">
-                              <pic:nvPicPr>
-                                <pic:cNvPr id="0" name="Picture 756"/>
-                                <pic:cNvPicPr>
-                                  <a:picLocks noChangeAspect="1" noChangeArrowheads="1"/>
-                                </pic:cNvPicPr>
-                              </pic:nvPicPr>
-                              <pic:blipFill>
-                                <a:blip r:embed="rId10" cstate="print">
-                                  <a:extLst>
-                                    <a:ext uri="{28A0092B-C50C-407E-A947-70E740481C1C}">
-                                      <a14:useLocalDpi xmlns:a14="http://schemas.microsoft.com/office/drawing/2010/main" val="0"/>
-                                    </a:ext>
-                                  </a:extLst>
-                                </a:blip>
-                                <a:srcRect/>
-                                <a:stretch>
-                                  <a:fillRect/>
-                                </a:stretch>
-                              </pic:blipFill>
-                              <pic:spPr bwMode="auto">
-                                <a:xfrm>
-                                  <a:off x="0" y="0"/>
-                                  <a:ext cx="3937000" cy="1212850"/>
-                                </a:xfrm>
-                                <a:prstGeom prst="rect">
-                                  <a:avLst/>
-                                </a:prstGeom>
-                                <a:noFill/>
-                                <a:ln>
-                                  <a:noFill/>
-                                </a:ln>
-                              </pic:spPr>
-                            </pic:pic>
-                          </a:graphicData>
-                        </a:graphic>
-                      </wp:inline>
-                    </w:drawing>
-                  </w:r>
-                </w:p>
-                <w:p>
-                  <w:r>
-                    <w:lastRenderedPageBreak/>
+                  <w:r>
                     <w:t> </w:t>
                   </w:r>
                 </w:p>
@@ -1503,7 +1369,6 @@
                 </w:tcPr>
                 <w:p>
                   <w:r>
-                    <w:lastRenderedPageBreak/>
                     <w:t>Pass</w:t>
                   </w:r>
                 </w:p>
@@ -1529,7 +1394,6 @@
                 </w:tcPr>
                 <w:p>
                   <w:r>
-                    <w:lastRenderedPageBreak/>
                     <w:t>Interactive Auto</w:t>
                   </w:r>
                 </w:p>
@@ -1553,168 +1417,11 @@
                 </w:tcPr>
                 <w:p>
                   <w:r>
-                    <w:t>Fail</w:t>
-                  </w:r>
-                  <w:r>
-                    <w:br/>
-                  </w:r>
-                  <w:r>
-                    <w:br/>
-                  </w:r>
-                  <w:r>
-                    <w:rPr>
-                      <w:b/>
-                      <w:bCs/>
-                    </w:rPr>
-                    <w:t>Failure Details:</w:t>
-                  </w:r>
-                </w:p>
-                <w:p>
-                  <w:pPr>
-                    <w:numPr>
-                      <w:ilvl w:val="1"/>
-                      <w:numId w:val="10"/>
-                    </w:numPr>
-                  </w:pPr>
-                  <w:r>
-                    <w:t>The following issue was faced while creating the Docker image:</w:t>
-                  </w:r>
-                  <w:r>
-                    <w:br/>
-                    <w:t> </w:t>
-                  </w:r>
-                </w:p>
-                <w:p>
-                  <w:r>
                     <w:rPr>
                       <w:noProof/>
                     </w:rPr>
-                    <w:drawing>
-                      <wp:inline distT="0" distB="0" distL="0" distR="0" wp14:anchorId="316A4102" wp14:editId="00E78F6D">
-                        <wp:extent cx="3797300" cy="1962150"/>
-                        <wp:effectExtent l="0" t="0" r="0" b="0"/>
-                        <wp:docPr id="1342176513" name="Picture 22"/>
-                        <wp:cNvGraphicFramePr>
-                          <a:graphicFrameLocks xmlns:a="http://schemas.openxmlformats.org/drawingml/2006/main" noChangeAspect="1"/>
-                        </wp:cNvGraphicFramePr>
-                        <a:graphic xmlns:a="http://schemas.openxmlformats.org/drawingml/2006/main">
-                          <a:graphicData uri="http://schemas.openxmlformats.org/drawingml/2006/picture">
-                            <pic:pic xmlns:pic="http://schemas.openxmlformats.org/drawingml/2006/picture">
-                              <pic:nvPicPr>
-                                <pic:cNvPr id="0" name="Picture 757"/>
-                                <pic:cNvPicPr>
-                                  <a:picLocks noChangeAspect="1" noChangeArrowheads="1"/>
-                                </pic:cNvPicPr>
-                              </pic:nvPicPr>
-                              <pic:blipFill>
-                                <a:blip r:embed="rId11" cstate="print">
-                                  <a:extLst>
-                                    <a:ext uri="{28A0092B-C50C-407E-A947-70E740481C1C}">
-                                      <a14:useLocalDpi xmlns:a14="http://schemas.microsoft.com/office/drawing/2010/main" val="0"/>
-                                    </a:ext>
-                                  </a:extLst>
-                                </a:blip>
-                                <a:srcRect/>
-                                <a:stretch>
-                                  <a:fillRect/>
-                                </a:stretch>
-                              </pic:blipFill>
-                              <pic:spPr bwMode="auto">
-                                <a:xfrm>
-                                  <a:off x="0" y="0"/>
-                                  <a:ext cx="3797300" cy="1962150"/>
-                                </a:xfrm>
-                                <a:prstGeom prst="rect">
-                                  <a:avLst/>
-                                </a:prstGeom>
-                                <a:noFill/>
-                                <a:ln>
-                                  <a:noFill/>
-                                </a:ln>
-                              </pic:spPr>
-                            </pic:pic>
-                          </a:graphicData>
-                        </a:graphic>
-                      </wp:inline>
-                    </w:drawing>
-                  </w:r>
-                </w:p>
-                <w:p>
-                  <w:r>
-                    <w:t> </w:t>
-                  </w:r>
-                </w:p>
-                <w:p>
-                  <w:pPr>
-                    <w:numPr>
-                      <w:ilvl w:val="1"/>
-                      <w:numId w:val="10"/>
-                    </w:numPr>
-                  </w:pPr>
-                  <w:r>
-                    <w:t xml:space="preserve">After moving the Dockerfile from the server project folder to the root folder of the project, the COPY path issue was fixed. The image was generated successfully, </w:t>
-                  </w:r>
-                  <w:r>
-                    <w:lastRenderedPageBreak/>
-                    <w:t>and it is running fine in the container.</w:t>
-                  </w:r>
-                </w:p>
-                <w:p>
-                  <w:r>
-                    <w:rPr>
-                      <w:noProof/>
-                    </w:rPr>
-                    <w:drawing>
-                      <wp:inline distT="0" distB="0" distL="0" distR="0" wp14:anchorId="544CC5F6" wp14:editId="2EA78186">
-                        <wp:extent cx="4311650" cy="1409700"/>
-                        <wp:effectExtent l="0" t="0" r="0" b="0"/>
-                        <wp:docPr id="2092387699" name="Picture 21"/>
-                        <wp:cNvGraphicFramePr>
-                          <a:graphicFrameLocks xmlns:a="http://schemas.openxmlformats.org/drawingml/2006/main" noChangeAspect="1"/>
-                        </wp:cNvGraphicFramePr>
-                        <a:graphic xmlns:a="http://schemas.openxmlformats.org/drawingml/2006/main">
-                          <a:graphicData uri="http://schemas.openxmlformats.org/drawingml/2006/picture">
-                            <pic:pic xmlns:pic="http://schemas.openxmlformats.org/drawingml/2006/picture">
-                              <pic:nvPicPr>
-                                <pic:cNvPr id="0" name="Picture 758"/>
-                                <pic:cNvPicPr>
-                                  <a:picLocks noChangeAspect="1" noChangeArrowheads="1"/>
-                                </pic:cNvPicPr>
-                              </pic:nvPicPr>
-                              <pic:blipFill>
-                                <a:blip r:embed="rId12" cstate="print">
-                                  <a:extLst>
-                                    <a:ext uri="{28A0092B-C50C-407E-A947-70E740481C1C}">
-                                      <a14:useLocalDpi xmlns:a14="http://schemas.microsoft.com/office/drawing/2010/main" val="0"/>
-                                    </a:ext>
-                                  </a:extLst>
-                                </a:blip>
-                                <a:srcRect/>
-                                <a:stretch>
-                                  <a:fillRect/>
-                                </a:stretch>
-                              </pic:blipFill>
-                              <pic:spPr bwMode="auto">
-                                <a:xfrm>
-                                  <a:off x="0" y="0"/>
-                                  <a:ext cx="4311650" cy="1409700"/>
-                                </a:xfrm>
-                                <a:prstGeom prst="rect">
-                                  <a:avLst/>
-                                </a:prstGeom>
-                                <a:noFill/>
-                                <a:ln>
-                                  <a:noFill/>
-                                </a:ln>
-                              </pic:spPr>
-                            </pic:pic>
-                          </a:graphicData>
-                        </a:graphic>
-                      </wp:inline>
-                    </w:drawing>
-                  </w:r>
-                </w:p>
-                <w:p>
+                    <w:t>Pass</w:t>
+                  </w:r>
                   <w:r>
                     <w:t> </w:t>
                   </w:r>
@@ -1739,7 +1446,6 @@
                 </w:tcPr>
                 <w:p>
                   <w:r>
-                    <w:lastRenderedPageBreak/>
                     <w:t>Pass</w:t>
                   </w:r>
                 </w:p>
@@ -1771,22 +1477,42 @@
                 <w:b/>
                 <w:bCs/>
               </w:rPr>
-              <w:lastRenderedPageBreak/>
               <w:t xml:space="preserve">Docker CLI: </w:t>
             </w:r>
-            <w:hyperlink r:id="rId13" w:history="1">
+            <w:hyperlink r:id="rId9" w:history="1">
               <w:r>
                 <w:rPr>
                   <w:rStyle w:val="Hyperlink"/>
                 </w:rPr>
-                <w:t>BlazorWebApp-ContainerSupport-Validation/Evidence/ContainerSupport-On-CreationDialog/cli-container-run.zip at main · BharatRamsf3693/BlazorWebAp</w:t>
+                <w:t>BlazorWebApp-ContainerSupport-Validation/Evidence/ContainerSupport-On-CreationDialog/cli-container-run.zip at main · BharatRamsf3693/</w:t>
               </w:r>
+              <w:proofErr w:type="spellStart"/>
               <w:r>
                 <w:rPr>
                   <w:rStyle w:val="Hyperlink"/>
                 </w:rPr>
-                <w:lastRenderedPageBreak/>
-                <w:t>p-ContainerSupport-Validation</w:t>
+                <w:t>BlazorWebApp</w:t>
+              </w:r>
+              <w:proofErr w:type="spellEnd"/>
+              <w:r>
+                <w:rPr>
+                  <w:rStyle w:val="Hyperlink"/>
+                </w:rPr>
+                <w:t>-</w:t>
+              </w:r>
+              <w:proofErr w:type="spellStart"/>
+              <w:r>
+                <w:rPr>
+                  <w:rStyle w:val="Hyperlink"/>
+                </w:rPr>
+                <w:t>ContainerSupport</w:t>
+              </w:r>
+              <w:proofErr w:type="spellEnd"/>
+              <w:r>
+                <w:rPr>
+                  <w:rStyle w:val="Hyperlink"/>
+                </w:rPr>
+                <w:t>-Validation</w:t>
               </w:r>
             </w:hyperlink>
             <w:r>
@@ -1802,12 +1528,40 @@
               </w:rPr>
               <w:t xml:space="preserve">Visual Studio 2026 Insider Container Launch: </w:t>
             </w:r>
-            <w:hyperlink r:id="rId14" w:history="1">
+            <w:hyperlink r:id="rId10" w:history="1">
               <w:r>
                 <w:rPr>
                   <w:rStyle w:val="Hyperlink"/>
                 </w:rPr>
-                <w:t>BlazorWebApp-ContainerSupport-Validation/Evidence/ContainerSupport-On-CreationDialog/vs-container-run.zip at main · BharatRamsf3693/BlazorWebApp-ContainerSupport-Validation</w:t>
+                <w:t>BlazorWebApp-ContainerSupport-Validation/Evidence/ContainerSupport-On-CreationDialog/vs-container-run.zip at main · BharatRamsf3693/</w:t>
+              </w:r>
+              <w:proofErr w:type="spellStart"/>
+              <w:r>
+                <w:rPr>
+                  <w:rStyle w:val="Hyperlink"/>
+                </w:rPr>
+                <w:t>BlazorWebApp</w:t>
+              </w:r>
+              <w:proofErr w:type="spellEnd"/>
+              <w:r>
+                <w:rPr>
+                  <w:rStyle w:val="Hyperlink"/>
+                </w:rPr>
+                <w:t>-</w:t>
+              </w:r>
+              <w:proofErr w:type="spellStart"/>
+              <w:r>
+                <w:rPr>
+                  <w:rStyle w:val="Hyperlink"/>
+                </w:rPr>
+                <w:t>ContainerSupport</w:t>
+              </w:r>
+              <w:proofErr w:type="spellEnd"/>
+              <w:r>
+                <w:rPr>
+                  <w:rStyle w:val="Hyperlink"/>
+                </w:rPr>
+                <w:t>-Validation</w:t>
               </w:r>
             </w:hyperlink>
           </w:p>
@@ -1833,7 +1587,6 @@
           </w:tcPr>
           <w:p>
             <w:r>
-              <w:lastRenderedPageBreak/>
               <w:t>3.</w:t>
             </w:r>
           </w:p>
@@ -1857,11 +1610,11 @@
           </w:tcPr>
           <w:p>
             <w:r>
-              <w:t xml:space="preserve">In the container, every sample page works, interactivity starts, and the image and stylesheet on your own page load with no 404 in the browser </w:t>
+              <w:t xml:space="preserve">In the container, every sample page works, </w:t>
             </w:r>
             <w:r>
               <w:lastRenderedPageBreak/>
-              <w:t>network log.</w:t>
+              <w:t>interactivity starts, and the image and stylesheet on your own page load with no 404 in the browser network log.</w:t>
             </w:r>
           </w:p>
         </w:tc>
@@ -1900,9 +1653,9 @@
               <w:tblDescription w:val=""/>
             </w:tblPr>
             <w:tblGrid>
-              <w:gridCol w:w="1400"/>
-              <w:gridCol w:w="1016"/>
-              <w:gridCol w:w="1880"/>
+              <w:gridCol w:w="938"/>
+              <w:gridCol w:w="719"/>
+              <w:gridCol w:w="936"/>
             </w:tblGrid>
             <w:tr>
               <w:tc>
@@ -1983,7 +1736,15 @@
                       <w:b/>
                       <w:bCs/>
                     </w:rPr>
-                    <w:t>Visual Studio 2026 Insider Container Launch</w:t>
+                    <w:t>Visual Studio 2026 Insider Contai</w:t>
+                  </w:r>
+                  <w:r>
+                    <w:rPr>
+                      <w:b/>
+                      <w:bCs/>
+                    </w:rPr>
+                    <w:lastRenderedPageBreak/>
+                    <w:t>ner Launch</w:t>
                   </w:r>
                 </w:p>
               </w:tc>
@@ -2008,6 +1769,7 @@
                 </w:tcPr>
                 <w:p>
                   <w:r>
+                    <w:lastRenderedPageBreak/>
                     <w:t>Static SSR</w:t>
                   </w:r>
                 </w:p>
@@ -2298,20 +2060,50 @@
                 <w:b/>
                 <w:bCs/>
               </w:rPr>
+              <w:lastRenderedPageBreak/>
               <w:t xml:space="preserve">Docker CLI: </w:t>
             </w:r>
-            <w:hyperlink r:id="rId15" w:history="1">
+            <w:hyperlink r:id="rId11" w:history="1">
               <w:r>
                 <w:rPr>
                   <w:rStyle w:val="Hyperlink"/>
                 </w:rPr>
-                <w:t>BlazorWebApp-ContainerSupport-Validation/Evidence/ContainerSupport-On-CreationDialog/cli-container-run.zip at main · BharatRamsf3693/BlazorWebApp-ContainerSupport-Validation</w:t>
+                <w:t>BlazorWebApp-ContainerSupport-Validation/Evidence/ContainerSupport-On-CreationDialog/cli-container-run.zip at main · BharatRamsf3693/</w:t>
+              </w:r>
+              <w:proofErr w:type="spellStart"/>
+              <w:r>
+                <w:rPr>
+                  <w:rStyle w:val="Hyperlink"/>
+                </w:rPr>
+                <w:t>BlazorWebApp</w:t>
+              </w:r>
+              <w:proofErr w:type="spellEnd"/>
+              <w:r>
+                <w:rPr>
+                  <w:rStyle w:val="Hyperlink"/>
+                </w:rPr>
+                <w:t>-</w:t>
+              </w:r>
+              <w:proofErr w:type="spellStart"/>
+              <w:r>
+                <w:rPr>
+                  <w:rStyle w:val="Hyperlink"/>
+                </w:rPr>
+                <w:t>ContainerSupport</w:t>
+              </w:r>
+              <w:proofErr w:type="spellEnd"/>
+              <w:r>
+                <w:rPr>
+                  <w:rStyle w:val="Hyperlink"/>
+                </w:rPr>
+                <w:t>-Validation</w:t>
               </w:r>
             </w:hyperlink>
             <w:r>
               <w:br/>
             </w:r>
             <w:r>
+              <w:lastRenderedPageBreak/>
               <w:br/>
             </w:r>
             <w:r>
@@ -2321,12 +2113,40 @@
               </w:rPr>
               <w:t xml:space="preserve">Visual Studio 2026 Insider Container Launch: </w:t>
             </w:r>
-            <w:hyperlink r:id="rId16" w:history="1">
+            <w:hyperlink r:id="rId12" w:history="1">
               <w:r>
                 <w:rPr>
                   <w:rStyle w:val="Hyperlink"/>
                 </w:rPr>
-                <w:t>BlazorWebApp-ContainerSupport-Validation/Evidence/ContainerSupport-On-CreationDialog/vs-container-run.zip at main · BharatRamsf3693/BlazorWebApp-ContainerSupport-Validation</w:t>
+                <w:t>BlazorWebApp-ContainerSupport-Validation/Evidence/ContainerSupport-On-CreationDialog/vs-container-run.zip at main · BharatRamsf3693/</w:t>
+              </w:r>
+              <w:proofErr w:type="spellStart"/>
+              <w:r>
+                <w:rPr>
+                  <w:rStyle w:val="Hyperlink"/>
+                </w:rPr>
+                <w:t>BlazorWebApp</w:t>
+              </w:r>
+              <w:proofErr w:type="spellEnd"/>
+              <w:r>
+                <w:rPr>
+                  <w:rStyle w:val="Hyperlink"/>
+                </w:rPr>
+                <w:t>-</w:t>
+              </w:r>
+              <w:proofErr w:type="spellStart"/>
+              <w:r>
+                <w:rPr>
+                  <w:rStyle w:val="Hyperlink"/>
+                </w:rPr>
+                <w:t>ContainerSupport</w:t>
+              </w:r>
+              <w:proofErr w:type="spellEnd"/>
+              <w:r>
+                <w:rPr>
+                  <w:rStyle w:val="Hyperlink"/>
+                </w:rPr>
+                <w:t>-Validation</w:t>
               </w:r>
             </w:hyperlink>
           </w:p>
@@ -2438,9 +2258,9 @@
               <w:tblDescription w:val=""/>
             </w:tblPr>
             <w:tblGrid>
-              <w:gridCol w:w="1400"/>
-              <w:gridCol w:w="1016"/>
-              <w:gridCol w:w="1880"/>
+              <w:gridCol w:w="938"/>
+              <w:gridCol w:w="719"/>
+              <w:gridCol w:w="936"/>
             </w:tblGrid>
             <w:tr>
               <w:tc>
@@ -2568,7 +2388,7 @@
                 </w:tcPr>
                 <w:p>
                   <w:r>
-                    <w:t>Fail</w:t>
+                    <w:t>Pass</w:t>
                   </w:r>
                 </w:p>
               </w:tc>
@@ -2639,7 +2459,7 @@
                 </w:tcPr>
                 <w:p>
                   <w:r>
-                    <w:t>Fail</w:t>
+                    <w:t>Pass</w:t>
                   </w:r>
                 </w:p>
               </w:tc>
@@ -2695,12 +2515,40 @@
               </w:rPr>
               <w:t xml:space="preserve">Docker CLI: </w:t>
             </w:r>
-            <w:hyperlink r:id="rId17" w:history="1">
+            <w:hyperlink r:id="rId13" w:history="1">
               <w:r>
                 <w:rPr>
                   <w:rStyle w:val="Hyperlink"/>
                 </w:rPr>
-                <w:t>BlazorWebApp-ContainerSupport-Validation/Evidence/ContainerSupport-On-CreationDialog/cli-container-run.zip at main · BharatRamsf3693/BlazorWebApp-ContainerSupport-Validation</w:t>
+                <w:t>BlazorWebApp-ContainerSupport-Validation/Evidence/ContainerSupport-On-CreationDialog/cli-container-run.zip at main · BharatRamsf3693/</w:t>
+              </w:r>
+              <w:proofErr w:type="spellStart"/>
+              <w:r>
+                <w:rPr>
+                  <w:rStyle w:val="Hyperlink"/>
+                </w:rPr>
+                <w:t>BlazorWebApp</w:t>
+              </w:r>
+              <w:proofErr w:type="spellEnd"/>
+              <w:r>
+                <w:rPr>
+                  <w:rStyle w:val="Hyperlink"/>
+                </w:rPr>
+                <w:t>-</w:t>
+              </w:r>
+              <w:proofErr w:type="spellStart"/>
+              <w:r>
+                <w:rPr>
+                  <w:rStyle w:val="Hyperlink"/>
+                </w:rPr>
+                <w:t>ContainerSupport</w:t>
+              </w:r>
+              <w:proofErr w:type="spellEnd"/>
+              <w:r>
+                <w:rPr>
+                  <w:rStyle w:val="Hyperlink"/>
+                </w:rPr>
+                <w:t>-Validation</w:t>
               </w:r>
             </w:hyperlink>
             <w:r>
@@ -2716,12 +2564,40 @@
               </w:rPr>
               <w:t xml:space="preserve">Visual Studio 2026 Insider Container Launch: </w:t>
             </w:r>
-            <w:hyperlink r:id="rId18" w:history="1">
+            <w:hyperlink r:id="rId14" w:history="1">
               <w:r>
                 <w:rPr>
                   <w:rStyle w:val="Hyperlink"/>
                 </w:rPr>
-                <w:t>BlazorWebApp-ContainerSupport-Validation/Evidence/ContainerSupport-On-CreationDialog/vs-container-run.zip at main · BharatRamsf3693/BlazorWebApp-ContainerSupport-Validation</w:t>
+                <w:t>BlazorWebApp-ContainerSupport-Validation/Evidence/ContainerSupport-On-CreationDialog/vs-container-run.zip at main · BharatRamsf3693/</w:t>
+              </w:r>
+              <w:proofErr w:type="spellStart"/>
+              <w:r>
+                <w:rPr>
+                  <w:rStyle w:val="Hyperlink"/>
+                </w:rPr>
+                <w:t>BlazorWebApp</w:t>
+              </w:r>
+              <w:proofErr w:type="spellEnd"/>
+              <w:r>
+                <w:rPr>
+                  <w:rStyle w:val="Hyperlink"/>
+                </w:rPr>
+                <w:t>-</w:t>
+              </w:r>
+              <w:proofErr w:type="spellStart"/>
+              <w:r>
+                <w:rPr>
+                  <w:rStyle w:val="Hyperlink"/>
+                </w:rPr>
+                <w:t>ContainerSupport</w:t>
+              </w:r>
+              <w:proofErr w:type="spellEnd"/>
+              <w:r>
+                <w:rPr>
+                  <w:rStyle w:val="Hyperlink"/>
+                </w:rPr>
+                <w:t>-Validation</w:t>
               </w:r>
             </w:hyperlink>
           </w:p>
@@ -2747,6 +2623,7 @@
           </w:tcPr>
           <w:p>
             <w:r>
+              <w:lastRenderedPageBreak/>
               <w:t>5.</w:t>
             </w:r>
           </w:p>
@@ -2770,15 +2647,19 @@
           </w:tcPr>
           <w:p>
             <w:r>
-              <w:t xml:space="preserve">Reading the generated Dockerfile for the two-project shapes, checking how </w:t>
+              <w:t xml:space="preserve">Reading the generated </w:t>
+            </w:r>
+            <w:proofErr w:type="spellStart"/>
+            <w:r>
+              <w:t>Dockerfile</w:t>
+            </w:r>
+            <w:proofErr w:type="spellEnd"/>
+            <w:r>
+              <w:t xml:space="preserve"> for the two-project shapes, checking how </w:t>
             </w:r>
             <w:proofErr w:type="gramStart"/>
             <w:r>
-              <w:t>the .Cli</w:t>
-            </w:r>
-            <w:r>
-              <w:lastRenderedPageBreak/>
-              <w:t>ent</w:t>
+              <w:t>the .Client</w:t>
             </w:r>
             <w:proofErr w:type="gramEnd"/>
             <w:r>
@@ -2821,8 +2702,8 @@
               <w:tblDescription w:val=""/>
             </w:tblPr>
             <w:tblGrid>
-              <w:gridCol w:w="1252"/>
-              <w:gridCol w:w="3044"/>
+              <w:gridCol w:w="1166"/>
+              <w:gridCol w:w="1427"/>
             </w:tblGrid>
             <w:tr>
               <w:tc>
@@ -2848,7 +2729,6 @@
                       <w:b/>
                       <w:bCs/>
                     </w:rPr>
-                    <w:lastRenderedPageBreak/>
                     <w:t>Blazor Web App</w:t>
                   </w:r>
                 </w:p>
@@ -2943,7 +2823,15 @@
                     <w:br/>
                   </w:r>
                   <w:r>
-                    <w:t xml:space="preserve">It appears that the Dockerfile generated for the client project is unnecessary, as building and publishing the client project is redundant since it is a dependency </w:t>
+                    <w:t xml:space="preserve">It appears that the </w:t>
+                  </w:r>
+                  <w:proofErr w:type="spellStart"/>
+                  <w:r>
+                    <w:t>Dockerfile</w:t>
+                  </w:r>
+                  <w:proofErr w:type="spellEnd"/>
+                  <w:r>
+                    <w:t xml:space="preserve"> generated for the client project is unnecessary, as building and publishing the client project is redundant since it is a dependency </w:t>
                   </w:r>
                   <w:proofErr w:type="gramStart"/>
                   <w:r>
@@ -2951,15 +2839,23 @@
                   </w:r>
                   <w:proofErr w:type="gramEnd"/>
                   <w:r>
-                    <w:t xml:space="preserve"> the server project. Additionally, </w:t>
+                    <w:t xml:space="preserve"> the server project. Additionally, the </w:t>
+                  </w:r>
+                  <w:proofErr w:type="spellStart"/>
+                  <w:r>
+                    <w:t>Dockerfile</w:t>
+                  </w:r>
+                  <w:proofErr w:type="spellEnd"/>
+                  <w:r>
+                    <w:t xml:space="preserve"> in the server project should be moved to the root folder of the project </w:t>
+                  </w:r>
+                  <w:proofErr w:type="gramStart"/>
+                  <w:r>
+                    <w:t xml:space="preserve">in </w:t>
                   </w:r>
                   <w:r>
                     <w:lastRenderedPageBreak/>
-                    <w:t xml:space="preserve">the Dockerfile in the server project should be moved to the root folder of the project </w:t>
-                  </w:r>
-                  <w:proofErr w:type="gramStart"/>
-                  <w:r>
-                    <w:t>in order to</w:t>
+                    <w:t>order to</w:t>
                   </w:r>
                   <w:proofErr w:type="gramEnd"/>
                   <w:r>
@@ -3031,7 +2927,15 @@
                     <w:br/>
                   </w:r>
                   <w:r>
-                    <w:t xml:space="preserve">It appears that the Dockerfile generated for the client project is unnecessary, as building and publishing the client project is redundant since it is a dependency </w:t>
+                    <w:t xml:space="preserve">It appears that the </w:t>
+                  </w:r>
+                  <w:proofErr w:type="spellStart"/>
+                  <w:r>
+                    <w:t>Dockerfile</w:t>
+                  </w:r>
+                  <w:proofErr w:type="spellEnd"/>
+                  <w:r>
+                    <w:t xml:space="preserve"> generated for the client project is unnecessary, as building and publishing the client project is redundant since it is a dependency </w:t>
                   </w:r>
                   <w:proofErr w:type="gramStart"/>
                   <w:r>
@@ -3039,7 +2943,19 @@
                   </w:r>
                   <w:proofErr w:type="gramEnd"/>
                   <w:r>
-                    <w:t xml:space="preserve"> the server project. Additionally, the Dockerfile in the server project should be moved to the root folder of the project </w:t>
+                    <w:t xml:space="preserve"> the server project. Additionally, the </w:t>
+                  </w:r>
+                  <w:proofErr w:type="spellStart"/>
+                  <w:r>
+                    <w:t>Dockerfile</w:t>
+                  </w:r>
+                  <w:proofErr w:type="spellEnd"/>
+                  <w:r>
+                    <w:t xml:space="preserve"> in the server </w:t>
+                  </w:r>
+                  <w:r>
+                    <w:lastRenderedPageBreak/>
+                    <w:t xml:space="preserve">project should be moved to the root folder of the project </w:t>
                   </w:r>
                   <w:proofErr w:type="gramStart"/>
                   <w:r>
@@ -3079,7 +2995,23 @@
                 <w:bCs/>
               </w:rPr>
               <w:lastRenderedPageBreak/>
-              <w:t>Interactive Webassembly:</w:t>
+              <w:t xml:space="preserve">Interactive </w:t>
+            </w:r>
+            <w:proofErr w:type="spellStart"/>
+            <w:r>
+              <w:rPr>
+                <w:b/>
+                <w:bCs/>
+              </w:rPr>
+              <w:t>Webassembly</w:t>
+            </w:r>
+            <w:proofErr w:type="spellEnd"/>
+            <w:r>
+              <w:rPr>
+                <w:b/>
+                <w:bCs/>
+              </w:rPr>
+              <w:t>:</w:t>
             </w:r>
           </w:p>
           <w:p>
@@ -3088,14 +3020,58 @@
                 <w:b/>
                 <w:bCs/>
               </w:rPr>
-              <w:t xml:space="preserve">Server project Dockerfile: </w:t>
+              <w:t xml:space="preserve">Server project </w:t>
             </w:r>
-            <w:hyperlink r:id="rId19" w:history="1">
+            <w:proofErr w:type="spellStart"/>
+            <w:r>
+              <w:rPr>
+                <w:b/>
+                <w:bCs/>
+              </w:rPr>
+              <w:t>Dockerfile</w:t>
+            </w:r>
+            <w:proofErr w:type="spellEnd"/>
+            <w:r>
+              <w:rPr>
+                <w:b/>
+                <w:bCs/>
+              </w:rPr>
+              <w:t xml:space="preserve">: </w:t>
+            </w:r>
+            <w:hyperlink r:id="rId15" w:history="1">
               <w:r>
                 <w:rPr>
                   <w:rStyle w:val="Hyperlink"/>
                 </w:rPr>
-                <w:t>BlazorWebApp-ContainerSupport-Validation/ContainerSupport-On-CreationDialog/InteractiveWebAssembly/InteractiveWebAssembly/Dockerfile at main · BharatRamsf3693/BlazorWebApp-ContainerSupport-Validation</w:t>
+                <w:t>BlazorWebApp-ContainerSupport-Validation/ContainerSupport-On-CreationDialog/InteractiveWebAssembly/InteractiveWebAssembly/Dockerfile at main · BharatRamsf3693/</w:t>
+              </w:r>
+              <w:proofErr w:type="spellStart"/>
+              <w:r>
+                <w:rPr>
+                  <w:rStyle w:val="Hyperlink"/>
+                </w:rPr>
+                <w:t>BlazorWebApp</w:t>
+              </w:r>
+              <w:proofErr w:type="spellEnd"/>
+              <w:r>
+                <w:rPr>
+                  <w:rStyle w:val="Hyperlink"/>
+                </w:rPr>
+                <w:t>-</w:t>
+              </w:r>
+              <w:proofErr w:type="spellStart"/>
+              <w:r>
+                <w:rPr>
+                  <w:rStyle w:val="Hyperlink"/>
+                </w:rPr>
+                <w:t>ContainerSupport</w:t>
+              </w:r>
+              <w:proofErr w:type="spellEnd"/>
+              <w:r>
+                <w:rPr>
+                  <w:rStyle w:val="Hyperlink"/>
+                </w:rPr>
+                <w:t>-Validation</w:t>
               </w:r>
             </w:hyperlink>
           </w:p>
@@ -3110,15 +3086,58 @@
                 <w:b/>
                 <w:bCs/>
               </w:rPr>
-              <w:lastRenderedPageBreak/>
-              <w:t xml:space="preserve">Client project Dockerfile: </w:t>
+              <w:t xml:space="preserve">Client project </w:t>
             </w:r>
-            <w:hyperlink r:id="rId20" w:history="1">
+            <w:proofErr w:type="spellStart"/>
+            <w:r>
+              <w:rPr>
+                <w:b/>
+                <w:bCs/>
+              </w:rPr>
+              <w:t>Dockerfile</w:t>
+            </w:r>
+            <w:proofErr w:type="spellEnd"/>
+            <w:r>
+              <w:rPr>
+                <w:b/>
+                <w:bCs/>
+              </w:rPr>
+              <w:t xml:space="preserve">: </w:t>
+            </w:r>
+            <w:hyperlink r:id="rId16" w:history="1">
               <w:r>
                 <w:rPr>
                   <w:rStyle w:val="Hyperlink"/>
                 </w:rPr>
-                <w:t>BlazorWebApp-ContainerSupport-Validation/ContainerSupport-On-CreationDialog/InteractiveWebAssembly/InteractiveWebAssembly.Client/Dockerfile at main · BharatRamsf3693/BlazorWebApp-ContainerSupport-Validation</w:t>
+                <w:t>BlazorWebApp-ContainerSupport-Validation/ContainerSupport-On-CreationDialog/InteractiveWebAssembly/InteractiveWebAssembly.Client/Dockerfile at main · BharatRamsf3693/</w:t>
+              </w:r>
+              <w:proofErr w:type="spellStart"/>
+              <w:r>
+                <w:rPr>
+                  <w:rStyle w:val="Hyperlink"/>
+                </w:rPr>
+                <w:t>BlazorWebApp</w:t>
+              </w:r>
+              <w:proofErr w:type="spellEnd"/>
+              <w:r>
+                <w:rPr>
+                  <w:rStyle w:val="Hyperlink"/>
+                </w:rPr>
+                <w:t>-</w:t>
+              </w:r>
+              <w:proofErr w:type="spellStart"/>
+              <w:r>
+                <w:rPr>
+                  <w:rStyle w:val="Hyperlink"/>
+                </w:rPr>
+                <w:t>ContainerSupport</w:t>
+              </w:r>
+              <w:proofErr w:type="spellEnd"/>
+              <w:r>
+                <w:rPr>
+                  <w:rStyle w:val="Hyperlink"/>
+                </w:rPr>
+                <w:t>-Validation</w:t>
               </w:r>
             </w:hyperlink>
           </w:p>
@@ -3142,14 +3161,58 @@
                 <w:b/>
                 <w:bCs/>
               </w:rPr>
-              <w:t xml:space="preserve">Server project Dockerfile: </w:t>
+              <w:t xml:space="preserve">Server project </w:t>
             </w:r>
-            <w:hyperlink r:id="rId21" w:history="1">
+            <w:proofErr w:type="spellStart"/>
+            <w:r>
+              <w:rPr>
+                <w:b/>
+                <w:bCs/>
+              </w:rPr>
+              <w:t>Dockerfile</w:t>
+            </w:r>
+            <w:proofErr w:type="spellEnd"/>
+            <w:r>
+              <w:rPr>
+                <w:b/>
+                <w:bCs/>
+              </w:rPr>
+              <w:t xml:space="preserve">: </w:t>
+            </w:r>
+            <w:hyperlink r:id="rId17" w:history="1">
               <w:r>
                 <w:rPr>
                   <w:rStyle w:val="Hyperlink"/>
                 </w:rPr>
-                <w:t>BlazorWebApp-ContainerSupport-Validation/ContainerSupport-On-CreationDialog/InteractiveAuto/InteractiveAuto/Dockerfile at main · BharatRamsf3693/BlazorWebApp-ContainerSupport-Validation</w:t>
+                <w:t>BlazorWebApp-ContainerSupport-Validation/ContainerSupport-On-CreationDialog/InteractiveAuto/InteractiveAuto/Dockerfile at main · BharatRamsf3693/</w:t>
+              </w:r>
+              <w:proofErr w:type="spellStart"/>
+              <w:r>
+                <w:rPr>
+                  <w:rStyle w:val="Hyperlink"/>
+                </w:rPr>
+                <w:t>BlazorWebApp</w:t>
+              </w:r>
+              <w:proofErr w:type="spellEnd"/>
+              <w:r>
+                <w:rPr>
+                  <w:rStyle w:val="Hyperlink"/>
+                </w:rPr>
+                <w:t>-</w:t>
+              </w:r>
+              <w:proofErr w:type="spellStart"/>
+              <w:r>
+                <w:rPr>
+                  <w:rStyle w:val="Hyperlink"/>
+                </w:rPr>
+                <w:t>ContainerSupport</w:t>
+              </w:r>
+              <w:proofErr w:type="spellEnd"/>
+              <w:r>
+                <w:rPr>
+                  <w:rStyle w:val="Hyperlink"/>
+                </w:rPr>
+                <w:t>-Validation</w:t>
               </w:r>
             </w:hyperlink>
           </w:p>
@@ -3164,14 +3227,58 @@
                 <w:b/>
                 <w:bCs/>
               </w:rPr>
-              <w:t xml:space="preserve">Client project Dockerfile: </w:t>
+              <w:t xml:space="preserve">Client project </w:t>
             </w:r>
-            <w:hyperlink r:id="rId22" w:history="1">
+            <w:proofErr w:type="spellStart"/>
+            <w:r>
+              <w:rPr>
+                <w:b/>
+                <w:bCs/>
+              </w:rPr>
+              <w:t>Dockerfile</w:t>
+            </w:r>
+            <w:proofErr w:type="spellEnd"/>
+            <w:r>
+              <w:rPr>
+                <w:b/>
+                <w:bCs/>
+              </w:rPr>
+              <w:t xml:space="preserve">: </w:t>
+            </w:r>
+            <w:hyperlink r:id="rId18" w:history="1">
               <w:r>
                 <w:rPr>
                   <w:rStyle w:val="Hyperlink"/>
                 </w:rPr>
-                <w:t>BlazorWebApp-ContainerSupport-Validation/ContainerSupport-On-CreationDialog/InteractiveAuto/InteractiveAuto.Client/Dockerfile at main · BharatRamsf3693/BlazorWebApp-ContainerSupport-Validation</w:t>
+                <w:t>BlazorWebApp-ContainerSupport-Validation/ContainerSupport-On-CreationDialog/InteractiveAuto/InteractiveAuto.Client/Dockerfile at main · BharatRamsf3693/</w:t>
+              </w:r>
+              <w:proofErr w:type="spellStart"/>
+              <w:r>
+                <w:rPr>
+                  <w:rStyle w:val="Hyperlink"/>
+                </w:rPr>
+                <w:t>BlazorWebApp</w:t>
+              </w:r>
+              <w:proofErr w:type="spellEnd"/>
+              <w:r>
+                <w:rPr>
+                  <w:rStyle w:val="Hyperlink"/>
+                </w:rPr>
+                <w:t>-</w:t>
+              </w:r>
+              <w:proofErr w:type="spellStart"/>
+              <w:r>
+                <w:rPr>
+                  <w:rStyle w:val="Hyperlink"/>
+                </w:rPr>
+                <w:t>ContainerSupport</w:t>
+              </w:r>
+              <w:proofErr w:type="spellEnd"/>
+              <w:r>
+                <w:rPr>
+                  <w:rStyle w:val="Hyperlink"/>
+                </w:rPr>
+                <w:t>-Validation</w:t>
               </w:r>
             </w:hyperlink>
           </w:p>
@@ -3260,7 +3367,7 @@
               <w:tblDescription w:val=""/>
             </w:tblPr>
             <w:tblGrid>
-              <w:gridCol w:w="1901"/>
+              <w:gridCol w:w="1732"/>
               <w:gridCol w:w="861"/>
             </w:tblGrid>
             <w:tr>
@@ -3541,12 +3648,40 @@
             <w:r>
               <w:br/>
             </w:r>
-            <w:hyperlink r:id="rId23" w:history="1">
+            <w:hyperlink r:id="rId19" w:history="1">
               <w:r>
                 <w:rPr>
                   <w:rStyle w:val="Hyperlink"/>
                 </w:rPr>
-                <w:t>BlazorWebApp-ContainerSupport-Validation/Evidence/ContainerSupport-On-CreationDialog/outside-container.zip at main · BharatRamsf3693/BlazorWebApp-ContainerSupport-Validation</w:t>
+                <w:t>BlazorWebApp-ContainerSupport-Validation/Evidence/ContainerSupport-On-CreationDialog/outside-container.zip at main · BharatRamsf3693/</w:t>
+              </w:r>
+              <w:proofErr w:type="spellStart"/>
+              <w:r>
+                <w:rPr>
+                  <w:rStyle w:val="Hyperlink"/>
+                </w:rPr>
+                <w:t>BlazorWebApp</w:t>
+              </w:r>
+              <w:proofErr w:type="spellEnd"/>
+              <w:r>
+                <w:rPr>
+                  <w:rStyle w:val="Hyperlink"/>
+                </w:rPr>
+                <w:t>-</w:t>
+              </w:r>
+              <w:proofErr w:type="spellStart"/>
+              <w:r>
+                <w:rPr>
+                  <w:rStyle w:val="Hyperlink"/>
+                </w:rPr>
+                <w:t>ContainerSupport</w:t>
+              </w:r>
+              <w:proofErr w:type="spellEnd"/>
+              <w:r>
+                <w:rPr>
+                  <w:rStyle w:val="Hyperlink"/>
+                </w:rPr>
+                <w:t>-Validation</w:t>
               </w:r>
             </w:hyperlink>
           </w:p>
@@ -3599,7 +3734,11 @@
           </w:tcPr>
           <w:p>
             <w:r>
-              <w:t>A published image runs on its own outside the IDE.</w:t>
+              <w:t xml:space="preserve">A published image runs on its own </w:t>
+            </w:r>
+            <w:r>
+              <w:lastRenderedPageBreak/>
+              <w:t>outside the IDE.</w:t>
             </w:r>
           </w:p>
         </w:tc>
@@ -3638,8 +3777,8 @@
               <w:tblDescription w:val=""/>
             </w:tblPr>
             <w:tblGrid>
-              <w:gridCol w:w="1550"/>
-              <w:gridCol w:w="2746"/>
+              <w:gridCol w:w="1320"/>
+              <w:gridCol w:w="1273"/>
             </w:tblGrid>
             <w:tr>
               <w:tc>
@@ -3665,6 +3804,7 @@
                       <w:b/>
                       <w:bCs/>
                     </w:rPr>
+                    <w:lastRenderedPageBreak/>
                     <w:t>Blazor Web App</w:t>
                   </w:r>
                 </w:p>
@@ -3765,6 +3905,7 @@
                 </w:tcPr>
                 <w:p>
                   <w:r>
+                    <w:lastRenderedPageBreak/>
                     <w:t>Interactive Server</w:t>
                   </w:r>
                 </w:p>
@@ -3836,26 +3977,7 @@
                 </w:tcPr>
                 <w:p>
                   <w:r>
-                    <w:t>Fail</w:t>
-                  </w:r>
-                  <w:r>
-                    <w:br/>
-                  </w:r>
-                  <w:r>
-                    <w:br/>
-                  </w:r>
-                  <w:r>
-                    <w:rPr>
-                      <w:b/>
-                      <w:bCs/>
-                    </w:rPr>
-                    <w:t>Failure Details:</w:t>
-                  </w:r>
-                  <w:r>
-                    <w:br/>
-                  </w:r>
-                  <w:r>
-                    <w:t>The Docker image could not be created using the Docker CLI.</w:t>
+                    <w:t>Pass</w:t>
                   </w:r>
                 </w:p>
               </w:tc>
@@ -3903,26 +4025,7 @@
                 </w:tcPr>
                 <w:p>
                   <w:r>
-                    <w:t>Fail</w:t>
-                  </w:r>
-                  <w:r>
-                    <w:br/>
-                  </w:r>
-                  <w:r>
-                    <w:br/>
-                  </w:r>
-                  <w:r>
-                    <w:rPr>
-                      <w:b/>
-                      <w:bCs/>
-                    </w:rPr>
-                    <w:t>Failure Details:</w:t>
-                  </w:r>
-                  <w:r>
-                    <w:br/>
-                  </w:r>
-                  <w:r>
-                    <w:t>The Docker image could not be created using the Docker CLI.</w:t>
+                    <w:t>Pass</w:t>
                   </w:r>
                 </w:p>
               </w:tc>
@@ -3949,6 +4052,7 @@
           </w:tcPr>
           <w:p>
             <w:r>
+              <w:lastRenderedPageBreak/>
               <w:t xml:space="preserve">Here is the Docker Hub repository for </w:t>
             </w:r>
             <w:proofErr w:type="gramStart"/>
@@ -3967,7 +4071,7 @@
                 <w:numId w:val="11"/>
               </w:numPr>
             </w:pPr>
-            <w:hyperlink r:id="rId24" w:history="1">
+            <w:hyperlink r:id="rId20" w:history="1">
               <w:r>
                 <w:rPr>
                   <w:rStyle w:val="Hyperlink"/>
@@ -3983,7 +4087,7 @@
                 <w:numId w:val="11"/>
               </w:numPr>
             </w:pPr>
-            <w:hyperlink r:id="rId25" w:history="1">
+            <w:hyperlink r:id="rId21" w:history="1">
               <w:r>
                 <w:rPr>
                   <w:rStyle w:val="Hyperlink"/>
@@ -3993,15 +4097,105 @@
             </w:hyperlink>
           </w:p>
           <w:p>
-            <w:r>
-              <w:t xml:space="preserve">Video evidence: </w:t>
-            </w:r>
-            <w:hyperlink r:id="rId26" w:history="1">
+            <w:pPr>
+              <w:numPr>
+                <w:ilvl w:val="0"/>
+                <w:numId w:val="11"/>
+              </w:numPr>
+            </w:pPr>
+            <w:hyperlink r:id="rId22" w:history="1">
+              <w:proofErr w:type="spellStart"/>
               <w:r>
                 <w:rPr>
                   <w:rStyle w:val="Hyperlink"/>
                 </w:rPr>
-                <w:t>BlazorWebApp-ContainerSupport-Validation/Evidence/ContainerSupport-On-CreationDialog/published-image.zip at main · BharatRamsf3693/BlazorWebApp-ContainerSupport-Validation</w:t>
+                <w:t>bharatramh</w:t>
+              </w:r>
+              <w:proofErr w:type="spellEnd"/>
+              <w:r>
+                <w:rPr>
+                  <w:rStyle w:val="Hyperlink"/>
+                </w:rPr>
+                <w:t>/interactive-</w:t>
+              </w:r>
+              <w:proofErr w:type="spellStart"/>
+              <w:r>
+                <w:rPr>
+                  <w:rStyle w:val="Hyperlink"/>
+                </w:rPr>
+                <w:t>webassembly</w:t>
+              </w:r>
+              <w:proofErr w:type="spellEnd"/>
+              <w:r>
+                <w:rPr>
+                  <w:rStyle w:val="Hyperlink"/>
+                </w:rPr>
+                <w:t xml:space="preserve"> - Docker Image</w:t>
+              </w:r>
+            </w:hyperlink>
+          </w:p>
+          <w:p>
+            <w:pPr>
+              <w:numPr>
+                <w:ilvl w:val="0"/>
+                <w:numId w:val="11"/>
+              </w:numPr>
+            </w:pPr>
+            <w:hyperlink r:id="rId23" w:history="1">
+              <w:proofErr w:type="spellStart"/>
+              <w:r>
+                <w:rPr>
+                  <w:rStyle w:val="Hyperlink"/>
+                </w:rPr>
+                <w:t>bharatramh</w:t>
+              </w:r>
+              <w:proofErr w:type="spellEnd"/>
+              <w:r>
+                <w:rPr>
+                  <w:rStyle w:val="Hyperlink"/>
+                </w:rPr>
+                <w:t>/interactive-auto - Docker Image</w:t>
+              </w:r>
+            </w:hyperlink>
+          </w:p>
+          <w:p>
+            <w:r>
+              <w:t xml:space="preserve">Video evidence: </w:t>
+            </w:r>
+            <w:hyperlink r:id="rId24" w:history="1">
+              <w:r>
+                <w:rPr>
+                  <w:rStyle w:val="Hyperlink"/>
+                </w:rPr>
+                <w:t>BlazorWebApp-ContainerSupport-Validation/Evidence/ContainerSupport-On-CreationDialog/published-image.zip at main · BharatRamsf3693/</w:t>
+              </w:r>
+              <w:proofErr w:type="spellStart"/>
+              <w:r>
+                <w:rPr>
+                  <w:rStyle w:val="Hyperlink"/>
+                </w:rPr>
+                <w:t>BlazorWebApp</w:t>
+              </w:r>
+              <w:proofErr w:type="spellEnd"/>
+              <w:r>
+                <w:rPr>
+                  <w:rStyle w:val="Hyperlink"/>
+                </w:rPr>
+                <w:t>-</w:t>
+              </w:r>
+              <w:proofErr w:type="spellStart"/>
+              <w:r>
+                <w:rPr>
+                  <w:rStyle w:val="Hyperlink"/>
+                </w:rPr>
+                <w:t>ContainerSupport</w:t>
+              </w:r>
+              <w:proofErr w:type="spellEnd"/>
+              <w:r>
+                <w:rPr>
+                  <w:rStyle w:val="Hyperlink"/>
+                </w:rPr>
+                <w:t>-Validation</w:t>
               </w:r>
             </w:hyperlink>
           </w:p>
@@ -4102,9 +4296,9 @@
               <w:tblDescription w:val=""/>
             </w:tblPr>
             <w:tblGrid>
-              <w:gridCol w:w="586"/>
-              <w:gridCol w:w="3125"/>
-              <w:gridCol w:w="585"/>
+              <w:gridCol w:w="938"/>
+              <w:gridCol w:w="719"/>
+              <w:gridCol w:w="936"/>
             </w:tblGrid>
             <w:tr>
               <w:tc>
@@ -4374,182 +4568,7 @@
                 </w:tcPr>
                 <w:p>
                   <w:r>
-                    <w:t>Fail</w:t>
-                  </w:r>
-                  <w:r>
-                    <w:br/>
-                  </w:r>
-                  <w:r>
-                    <w:br/>
-                  </w:r>
-                  <w:r>
-                    <w:rPr>
-                      <w:b/>
-                      <w:bCs/>
-                    </w:rPr>
-                    <w:t>Failure Details:</w:t>
-                  </w:r>
-                </w:p>
-                <w:p>
-                  <w:pPr>
-                    <w:numPr>
-                      <w:ilvl w:val="1"/>
-                      <w:numId w:val="12"/>
-                    </w:numPr>
-                  </w:pPr>
-                  <w:r>
-                    <w:t>The server project was right-clicked, and container support was added.</w:t>
-                  </w:r>
-                </w:p>
-                <w:p>
-                  <w:pPr>
-                    <w:numPr>
-                      <w:ilvl w:val="1"/>
-                      <w:numId w:val="12"/>
-                    </w:numPr>
-                  </w:pPr>
-                  <w:r>
-                    <w:t xml:space="preserve"> The following issue was faced while </w:t>
-                  </w:r>
-                  <w:r>
-                    <w:lastRenderedPageBreak/>
-                    <w:t>creating the Docker image:</w:t>
-                  </w:r>
-                </w:p>
-                <w:p>
-                  <w:r>
-                    <w:rPr>
-                      <w:noProof/>
-                    </w:rPr>
-                    <w:drawing>
-                      <wp:inline distT="0" distB="0" distL="0" distR="0" wp14:anchorId="20535F36" wp14:editId="1729A907">
-                        <wp:extent cx="3752850" cy="1828800"/>
-                        <wp:effectExtent l="0" t="0" r="0" b="0"/>
-                        <wp:docPr id="1724467763" name="Picture 20"/>
-                        <wp:cNvGraphicFramePr>
-                          <a:graphicFrameLocks xmlns:a="http://schemas.openxmlformats.org/drawingml/2006/main" noChangeAspect="1"/>
-                        </wp:cNvGraphicFramePr>
-                        <a:graphic xmlns:a="http://schemas.openxmlformats.org/drawingml/2006/main">
-                          <a:graphicData uri="http://schemas.openxmlformats.org/drawingml/2006/picture">
-                            <pic:pic xmlns:pic="http://schemas.openxmlformats.org/drawingml/2006/picture">
-                              <pic:nvPicPr>
-                                <pic:cNvPr id="0" name="Picture 759"/>
-                                <pic:cNvPicPr>
-                                  <a:picLocks noChangeAspect="1" noChangeArrowheads="1"/>
-                                </pic:cNvPicPr>
-                              </pic:nvPicPr>
-                              <pic:blipFill>
-                                <a:blip r:embed="rId27" cstate="print">
-                                  <a:extLst>
-                                    <a:ext uri="{28A0092B-C50C-407E-A947-70E740481C1C}">
-                                      <a14:useLocalDpi xmlns:a14="http://schemas.microsoft.com/office/drawing/2010/main" val="0"/>
-                                    </a:ext>
-                                  </a:extLst>
-                                </a:blip>
-                                <a:srcRect/>
-                                <a:stretch>
-                                  <a:fillRect/>
-                                </a:stretch>
-                              </pic:blipFill>
-                              <pic:spPr bwMode="auto">
-                                <a:xfrm>
-                                  <a:off x="0" y="0"/>
-                                  <a:ext cx="3752850" cy="1828800"/>
-                                </a:xfrm>
-                                <a:prstGeom prst="rect">
-                                  <a:avLst/>
-                                </a:prstGeom>
-                                <a:noFill/>
-                                <a:ln>
-                                  <a:noFill/>
-                                </a:ln>
-                              </pic:spPr>
-                            </pic:pic>
-                          </a:graphicData>
-                        </a:graphic>
-                      </wp:inline>
-                    </w:drawing>
-                  </w:r>
-                </w:p>
-                <w:p>
-                  <w:r>
-                    <w:t> </w:t>
-                  </w:r>
-                </w:p>
-                <w:p>
-                  <w:pPr>
-                    <w:numPr>
-                      <w:ilvl w:val="1"/>
-                      <w:numId w:val="12"/>
-                    </w:numPr>
-                  </w:pPr>
-                  <w:r>
-                    <w:t>After moving the Dockerfile from the server project folder to the root folder of the project, the COPY path issue was fixed. The image was generated successfully, and it is running fine in the container.</w:t>
-                  </w:r>
-                  <w:r>
-                    <w:br/>
-                    <w:t> </w:t>
-                  </w:r>
-                </w:p>
-                <w:p>
-                  <w:r>
-                    <w:rPr>
-                      <w:noProof/>
-                    </w:rPr>
-                    <w:drawing>
-                      <wp:inline distT="0" distB="0" distL="0" distR="0" wp14:anchorId="39786339" wp14:editId="71E27183">
-                        <wp:extent cx="3429000" cy="1104900"/>
-                        <wp:effectExtent l="0" t="0" r="0" b="0"/>
-                        <wp:docPr id="134253396" name="Picture 19"/>
-                        <wp:cNvGraphicFramePr>
-                          <a:graphicFrameLocks xmlns:a="http://schemas.openxmlformats.org/drawingml/2006/main" noChangeAspect="1"/>
-                        </wp:cNvGraphicFramePr>
-                        <a:graphic xmlns:a="http://schemas.openxmlformats.org/drawingml/2006/main">
-                          <a:graphicData uri="http://schemas.openxmlformats.org/drawingml/2006/picture">
-                            <pic:pic xmlns:pic="http://schemas.openxmlformats.org/drawingml/2006/picture">
-                              <pic:nvPicPr>
-                                <pic:cNvPr id="0" name="Picture 760"/>
-                                <pic:cNvPicPr>
-                                  <a:picLocks noChangeAspect="1" noChangeArrowheads="1"/>
-                                </pic:cNvPicPr>
-                              </pic:nvPicPr>
-                              <pic:blipFill>
-                                <a:blip r:embed="rId28" cstate="print">
-                                  <a:extLst>
-                                    <a:ext uri="{28A0092B-C50C-407E-A947-70E740481C1C}">
-                                      <a14:useLocalDpi xmlns:a14="http://schemas.microsoft.com/office/drawing/2010/main" val="0"/>
-                                    </a:ext>
-                                  </a:extLst>
-                                </a:blip>
-                                <a:srcRect/>
-                                <a:stretch>
-                                  <a:fillRect/>
-                                </a:stretch>
-                              </pic:blipFill>
-                              <pic:spPr bwMode="auto">
-                                <a:xfrm>
-                                  <a:off x="0" y="0"/>
-                                  <a:ext cx="3429000" cy="1104900"/>
-                                </a:xfrm>
-                                <a:prstGeom prst="rect">
-                                  <a:avLst/>
-                                </a:prstGeom>
-                                <a:noFill/>
-                                <a:ln>
-                                  <a:noFill/>
-                                </a:ln>
-                              </pic:spPr>
-                            </pic:pic>
-                          </a:graphicData>
-                        </a:graphic>
-                      </wp:inline>
-                    </w:drawing>
-                  </w:r>
-                </w:p>
-                <w:p>
-                  <w:r>
-                    <w:lastRenderedPageBreak/>
-                    <w:t> </w:t>
+                    <w:t>Pass</w:t>
                   </w:r>
                 </w:p>
               </w:tc>
@@ -4572,7 +4591,6 @@
                 </w:tcPr>
                 <w:p>
                   <w:r>
-                    <w:lastRenderedPageBreak/>
                     <w:t>Pass</w:t>
                   </w:r>
                 </w:p>
@@ -4622,181 +4640,7 @@
                 </w:tcPr>
                 <w:p>
                   <w:r>
-                    <w:t>Fail</w:t>
-                  </w:r>
-                  <w:r>
-                    <w:br/>
-                  </w:r>
-                  <w:r>
-                    <w:br/>
-                  </w:r>
-                  <w:r>
-                    <w:rPr>
-                      <w:b/>
-                      <w:bCs/>
-                    </w:rPr>
-                    <w:t>Failure Details:</w:t>
-                  </w:r>
-                </w:p>
-                <w:p>
-                  <w:pPr>
-                    <w:numPr>
-                      <w:ilvl w:val="1"/>
-                      <w:numId w:val="13"/>
-                    </w:numPr>
-                  </w:pPr>
-                  <w:r>
-                    <w:t>The server project was right-clicked, and container support was added.</w:t>
-                  </w:r>
-                </w:p>
-                <w:p>
-                  <w:pPr>
-                    <w:numPr>
-                      <w:ilvl w:val="1"/>
-                      <w:numId w:val="13"/>
-                    </w:numPr>
-                  </w:pPr>
-                  <w:r>
-                    <w:t>The following issue was faced while creating the Docker image:</w:t>
-                  </w:r>
-                </w:p>
-                <w:p>
-                  <w:r>
-                    <w:rPr>
-                      <w:noProof/>
-                    </w:rPr>
-                    <w:drawing>
-                      <wp:inline distT="0" distB="0" distL="0" distR="0" wp14:anchorId="5A835BEB" wp14:editId="06BD7E6B">
-                        <wp:extent cx="4826000" cy="2520950"/>
-                        <wp:effectExtent l="0" t="0" r="0" b="0"/>
-                        <wp:docPr id="1399988753" name="Picture 18"/>
-                        <wp:cNvGraphicFramePr>
-                          <a:graphicFrameLocks xmlns:a="http://schemas.openxmlformats.org/drawingml/2006/main" noChangeAspect="1"/>
-                        </wp:cNvGraphicFramePr>
-                        <a:graphic xmlns:a="http://schemas.openxmlformats.org/drawingml/2006/main">
-                          <a:graphicData uri="http://schemas.openxmlformats.org/drawingml/2006/picture">
-                            <pic:pic xmlns:pic="http://schemas.openxmlformats.org/drawingml/2006/picture">
-                              <pic:nvPicPr>
-                                <pic:cNvPr id="0" name="Picture 761"/>
-                                <pic:cNvPicPr>
-                                  <a:picLocks noChangeAspect="1" noChangeArrowheads="1"/>
-                                </pic:cNvPicPr>
-                              </pic:nvPicPr>
-                              <pic:blipFill>
-                                <a:blip r:embed="rId29" cstate="print">
-                                  <a:extLst>
-                                    <a:ext uri="{28A0092B-C50C-407E-A947-70E740481C1C}">
-                                      <a14:useLocalDpi xmlns:a14="http://schemas.microsoft.com/office/drawing/2010/main" val="0"/>
-                                    </a:ext>
-                                  </a:extLst>
-                                </a:blip>
-                                <a:srcRect/>
-                                <a:stretch>
-                                  <a:fillRect/>
-                                </a:stretch>
-                              </pic:blipFill>
-                              <pic:spPr bwMode="auto">
-                                <a:xfrm>
-                                  <a:off x="0" y="0"/>
-                                  <a:ext cx="4826000" cy="2520950"/>
-                                </a:xfrm>
-                                <a:prstGeom prst="rect">
-                                  <a:avLst/>
-                                </a:prstGeom>
-                                <a:noFill/>
-                                <a:ln>
-                                  <a:noFill/>
-                                </a:ln>
-                              </pic:spPr>
-                            </pic:pic>
-                          </a:graphicData>
-                        </a:graphic>
-                      </wp:inline>
-                    </w:drawing>
-                  </w:r>
-                </w:p>
-                <w:p>
-                  <w:r>
-                    <w:t> </w:t>
-                  </w:r>
-                </w:p>
-                <w:p>
-                  <w:pPr>
-                    <w:numPr>
-                      <w:ilvl w:val="1"/>
-                      <w:numId w:val="13"/>
-                    </w:numPr>
-                  </w:pPr>
-                  <w:r>
-                    <w:t xml:space="preserve">After moving the Dockerfile from the server project folder to the </w:t>
-                  </w:r>
-                  <w:r>
-                    <w:lastRenderedPageBreak/>
-                    <w:t>root folder of the project, the COPY path issue was fixed. The image was generated successfully, and it is running fine in the container.</w:t>
-                  </w:r>
-                  <w:r>
-                    <w:br/>
-                    <w:t> </w:t>
-                  </w:r>
-                </w:p>
-                <w:p>
-                  <w:r>
-                    <w:rPr>
-                      <w:noProof/>
-                    </w:rPr>
-                    <w:drawing>
-                      <wp:inline distT="0" distB="0" distL="0" distR="0" wp14:anchorId="7C6A3AE2" wp14:editId="5261A32B">
-                        <wp:extent cx="4610100" cy="1428750"/>
-                        <wp:effectExtent l="0" t="0" r="0" b="0"/>
-                        <wp:docPr id="903695519" name="Picture 17"/>
-                        <wp:cNvGraphicFramePr>
-                          <a:graphicFrameLocks xmlns:a="http://schemas.openxmlformats.org/drawingml/2006/main" noChangeAspect="1"/>
-                        </wp:cNvGraphicFramePr>
-                        <a:graphic xmlns:a="http://schemas.openxmlformats.org/drawingml/2006/main">
-                          <a:graphicData uri="http://schemas.openxmlformats.org/drawingml/2006/picture">
-                            <pic:pic xmlns:pic="http://schemas.openxmlformats.org/drawingml/2006/picture">
-                              <pic:nvPicPr>
-                                <pic:cNvPr id="0" name="Picture 762"/>
-                                <pic:cNvPicPr>
-                                  <a:picLocks noChangeAspect="1" noChangeArrowheads="1"/>
-                                </pic:cNvPicPr>
-                              </pic:nvPicPr>
-                              <pic:blipFill>
-                                <a:blip r:embed="rId30" cstate="print">
-                                  <a:extLst>
-                                    <a:ext uri="{28A0092B-C50C-407E-A947-70E740481C1C}">
-                                      <a14:useLocalDpi xmlns:a14="http://schemas.microsoft.com/office/drawing/2010/main" val="0"/>
-                                    </a:ext>
-                                  </a:extLst>
-                                </a:blip>
-                                <a:srcRect/>
-                                <a:stretch>
-                                  <a:fillRect/>
-                                </a:stretch>
-                              </pic:blipFill>
-                              <pic:spPr bwMode="auto">
-                                <a:xfrm>
-                                  <a:off x="0" y="0"/>
-                                  <a:ext cx="4610100" cy="1428750"/>
-                                </a:xfrm>
-                                <a:prstGeom prst="rect">
-                                  <a:avLst/>
-                                </a:prstGeom>
-                                <a:noFill/>
-                                <a:ln>
-                                  <a:noFill/>
-                                </a:ln>
-                              </pic:spPr>
-                            </pic:pic>
-                          </a:graphicData>
-                        </a:graphic>
-                      </wp:inline>
-                    </w:drawing>
-                  </w:r>
-                </w:p>
-                <w:p>
-                  <w:r>
-                    <w:t> </w:t>
+                    <w:t>Pass</w:t>
                   </w:r>
                 </w:p>
               </w:tc>
@@ -4819,7 +4663,6 @@
                 </w:tcPr>
                 <w:p>
                   <w:r>
-                    <w:lastRenderedPageBreak/>
                     <w:t>Pass</w:t>
                   </w:r>
                 </w:p>
@@ -4856,7 +4699,15 @@
             </w:r>
             <w:proofErr w:type="gramEnd"/>
             <w:r>
-              <w:t xml:space="preserve"> is the same when adding container support via either the creation dialog or the project context menu. However, for Interactive WASM and Auto apps, using the creation dialog introduces an additional issue during project creation and generates an unnecessary Dockerfile in the client project, as shown in the screenshot evidence provided in the scenarios above. In contrast, using the context menu avoids </w:t>
+              <w:t xml:space="preserve"> is the same when adding container support via either the creation dialog or the project context menu. However, for Interactive WASM and Auto apps, using the creation dialog introduces an issue during project creation and generates an unnecessary </w:t>
+            </w:r>
+            <w:proofErr w:type="spellStart"/>
+            <w:r>
+              <w:t>Dockerfile</w:t>
+            </w:r>
+            <w:proofErr w:type="spellEnd"/>
+            <w:r>
+              <w:t xml:space="preserve"> in the client project, as shown in the screenshot evidence provided in the scenarios above. In contrast, using the context menu avoids </w:t>
             </w:r>
             <w:proofErr w:type="gramStart"/>
             <w:r>
@@ -4887,12 +4738,40 @@
             <w:r>
               <w:t xml:space="preserve"> here: </w:t>
             </w:r>
-            <w:hyperlink r:id="rId31" w:history="1">
+            <w:hyperlink r:id="rId25" w:history="1">
               <w:r>
                 <w:rPr>
                   <w:rStyle w:val="Hyperlink"/>
                 </w:rPr>
-                <w:t>BlazorWebApp-ContainerSupport-Validation/Evidence/ContainerSupport-ContextMenu at main · BharatRamsf3693/BlazorWebApp-ContainerSupport-Validation</w:t>
+                <w:t>BlazorWebApp-ContainerSupport-Validation/Evidence/ContainerSupport-ContextMenu at main · BharatRamsf3693/</w:t>
+              </w:r>
+              <w:proofErr w:type="spellStart"/>
+              <w:r>
+                <w:rPr>
+                  <w:rStyle w:val="Hyperlink"/>
+                </w:rPr>
+                <w:t>BlazorWebApp</w:t>
+              </w:r>
+              <w:proofErr w:type="spellEnd"/>
+              <w:r>
+                <w:rPr>
+                  <w:rStyle w:val="Hyperlink"/>
+                </w:rPr>
+                <w:t>-</w:t>
+              </w:r>
+              <w:proofErr w:type="spellStart"/>
+              <w:r>
+                <w:rPr>
+                  <w:rStyle w:val="Hyperlink"/>
+                </w:rPr>
+                <w:t>ContainerSupport</w:t>
+              </w:r>
+              <w:proofErr w:type="spellEnd"/>
+              <w:r>
+                <w:rPr>
+                  <w:rStyle w:val="Hyperlink"/>
+                </w:rPr>
+                <w:t>-Validation</w:t>
               </w:r>
             </w:hyperlink>
           </w:p>
@@ -4926,7 +4805,54 @@
     </w:p>
     <w:p>
       <w:r>
-        <w:t>Container support generates broken COPY paths and unnecessary client Dockerfile for Blazor WASM/Auto apps.</w:t>
+        <w:t xml:space="preserve">When creating a Blazor Web App with </w:t>
+      </w:r>
+      <w:r>
+        <w:rPr>
+          <w:b/>
+          <w:bCs/>
+        </w:rPr>
+        <w:t xml:space="preserve">Interactive </w:t>
+      </w:r>
+      <w:proofErr w:type="spellStart"/>
+      <w:r>
+        <w:rPr>
+          <w:b/>
+          <w:bCs/>
+        </w:rPr>
+        <w:t>WebAssembly</w:t>
+      </w:r>
+      <w:proofErr w:type="spellEnd"/>
+      <w:r>
+        <w:t xml:space="preserve"> or </w:t>
+      </w:r>
+      <w:r>
+        <w:rPr>
+          <w:b/>
+          <w:bCs/>
+        </w:rPr>
+        <w:t>Auto</w:t>
+      </w:r>
+      <w:r>
+        <w:t xml:space="preserve"> render modes and enabling </w:t>
+      </w:r>
+      <w:r>
+        <w:rPr>
+          <w:b/>
+          <w:bCs/>
+        </w:rPr>
+        <w:t>Container Support</w:t>
+      </w:r>
+      <w:r>
+        <w:t xml:space="preserve"> in the creation wizard, a file path error pops up. Furthermore, an unnecessary </w:t>
+      </w:r>
+      <w:proofErr w:type="spellStart"/>
+      <w:r>
+        <w:t>Dockerfile</w:t>
+      </w:r>
+      <w:proofErr w:type="spellEnd"/>
+      <w:r>
+        <w:t xml:space="preserve"> is incorrectly generated for the client project.</w:t>
       </w:r>
     </w:p>
     <w:p>
@@ -4939,8 +4865,49 @@
       </w:r>
     </w:p>
     <w:p>
-      <w:r>
-        <w:t>When adding container support to a Blazor Web App during initial project creation, Visual Studio generates an unnecessary Dockerfile for the client project and places a Dockerfile inside the server project folder. The Dockerfile in the server project has an incorrect COPY path, which causes a failure during image creation.</w:t>
+      <w:pPr>
+        <w:numPr>
+          <w:ilvl w:val="0"/>
+          <w:numId w:val="18"/>
+        </w:numPr>
+      </w:pPr>
+      <w:r>
+        <w:t xml:space="preserve">A popup error interrupted the creation process, stating it could not find </w:t>
+      </w:r>
+      <w:proofErr w:type="spellStart"/>
+      <w:r>
+        <w:t>launchSettings.json</w:t>
+      </w:r>
+      <w:proofErr w:type="spellEnd"/>
+      <w:r>
+        <w:t xml:space="preserve"> in the client project.</w:t>
+      </w:r>
+    </w:p>
+    <w:p>
+      <w:pPr>
+        <w:numPr>
+          <w:ilvl w:val="0"/>
+          <w:numId w:val="18"/>
+        </w:numPr>
+      </w:pPr>
+      <w:r>
+        <w:t xml:space="preserve">After dismissing the popup, the project creation </w:t>
+      </w:r>
+      <w:proofErr w:type="gramStart"/>
+      <w:r>
+        <w:t>completed</w:t>
+      </w:r>
+      <w:proofErr w:type="gramEnd"/>
+      <w:r>
+        <w:t xml:space="preserve">, but a </w:t>
+      </w:r>
+      <w:proofErr w:type="spellStart"/>
+      <w:r>
+        <w:t>Dockerfile</w:t>
+      </w:r>
+      <w:proofErr w:type="spellEnd"/>
+      <w:r>
+        <w:t xml:space="preserve"> was erroneously generated for both the server and client projects.</w:t>
       </w:r>
     </w:p>
     <w:p>
@@ -4953,17 +4920,51 @@
       </w:r>
     </w:p>
     <w:p>
-      <w:r>
-        <w:lastRenderedPageBreak/>
-        <w:t xml:space="preserve">Visual Studio should generate a single, unified Dockerfile in the root folder of the project, or it should correct the COPY path within the server project's Dockerfile. A separate Dockerfile for the client project should not be created, as the client project is a dependency built and published automatically by the server project. The Docker image should </w:t>
-      </w:r>
-      <w:proofErr w:type="gramStart"/>
-      <w:r>
-        <w:t>build</w:t>
-      </w:r>
-      <w:proofErr w:type="gramEnd"/>
-      <w:r>
-        <w:t xml:space="preserve"> successfully.</w:t>
+      <w:pPr>
+        <w:numPr>
+          <w:ilvl w:val="0"/>
+          <w:numId w:val="19"/>
+        </w:numPr>
+      </w:pPr>
+      <w:r>
+        <w:t>The project should be created without any error popups.</w:t>
+      </w:r>
+    </w:p>
+    <w:p>
+      <w:pPr>
+        <w:numPr>
+          <w:ilvl w:val="0"/>
+          <w:numId w:val="19"/>
+        </w:numPr>
+      </w:pPr>
+      <w:r>
+        <w:t xml:space="preserve">A </w:t>
+      </w:r>
+      <w:proofErr w:type="spellStart"/>
+      <w:r>
+        <w:t>Dockerfile</w:t>
+      </w:r>
+      <w:proofErr w:type="spellEnd"/>
+      <w:r>
+        <w:t xml:space="preserve"> should only be generated for the server project. The client project is a </w:t>
+      </w:r>
+      <w:r>
+        <w:rPr>
+          <w:b/>
+          <w:bCs/>
+        </w:rPr>
+        <w:t>dependency of</w:t>
+      </w:r>
+      <w:r>
+        <w:t xml:space="preserve"> the server project, so it does not need its own </w:t>
+      </w:r>
+      <w:proofErr w:type="spellStart"/>
+      <w:r>
+        <w:t>Dockerfile</w:t>
+      </w:r>
+      <w:proofErr w:type="spellEnd"/>
+      <w:r>
+        <w:t>.</w:t>
       </w:r>
     </w:p>
     <w:p>
@@ -4976,83 +4977,163 @@
       </w:r>
     </w:p>
     <w:p>
+      <w:pPr>
+        <w:numPr>
+          <w:ilvl w:val="0"/>
+          <w:numId w:val="20"/>
+        </w:numPr>
+      </w:pPr>
+      <w:r>
+        <w:t xml:space="preserve">Open </w:t>
+      </w:r>
       <w:r>
         <w:rPr>
           <w:b/>
           <w:bCs/>
         </w:rPr>
-        <w:t>Scenario A: Via the Project Creation Dialog</w:t>
+        <w:t>Visual Studio 2026 Insider</w:t>
+      </w:r>
+      <w:r>
+        <w:t>.</w:t>
       </w:r>
     </w:p>
     <w:p>
       <w:pPr>
         <w:numPr>
           <w:ilvl w:val="0"/>
-          <w:numId w:val="14"/>
+          <w:numId w:val="20"/>
         </w:numPr>
       </w:pPr>
       <w:r>
-        <w:t>Open Visual Studio 2026 Insider.</w:t>
+        <w:t>Create a new Blazor Web App using the project creation wizard.</w:t>
       </w:r>
     </w:p>
     <w:p>
       <w:pPr>
         <w:numPr>
           <w:ilvl w:val="0"/>
-          <w:numId w:val="14"/>
+          <w:numId w:val="20"/>
         </w:numPr>
       </w:pPr>
       <w:r>
-        <w:t>Create a new Blazor Web App using the project creation wizard.</w:t>
+        <w:t xml:space="preserve">Choose </w:t>
+      </w:r>
+      <w:r>
+        <w:rPr>
+          <w:b/>
+          <w:bCs/>
+        </w:rPr>
+        <w:t xml:space="preserve">Interactive </w:t>
+      </w:r>
+      <w:proofErr w:type="spellStart"/>
+      <w:r>
+        <w:rPr>
+          <w:b/>
+          <w:bCs/>
+        </w:rPr>
+        <w:t>WebAssembly</w:t>
+      </w:r>
+      <w:proofErr w:type="spellEnd"/>
+      <w:r>
+        <w:t xml:space="preserve"> or </w:t>
+      </w:r>
+      <w:r>
+        <w:rPr>
+          <w:b/>
+          <w:bCs/>
+        </w:rPr>
+        <w:t>Auto</w:t>
+      </w:r>
+      <w:r>
+        <w:t xml:space="preserve"> as the interactive render mode.</w:t>
       </w:r>
     </w:p>
     <w:p>
       <w:pPr>
         <w:numPr>
           <w:ilvl w:val="0"/>
-          <w:numId w:val="14"/>
+          <w:numId w:val="20"/>
         </w:numPr>
       </w:pPr>
       <w:r>
-        <w:t>Select the Interactive WebAssembly or Auto interactive render modes.</w:t>
+        <w:t xml:space="preserve">Check </w:t>
+      </w:r>
+      <w:r>
+        <w:rPr>
+          <w:b/>
+          <w:bCs/>
+        </w:rPr>
+        <w:t>Enable Container Support</w:t>
+      </w:r>
+      <w:r>
+        <w:t xml:space="preserve"> in the creation dialog and click </w:t>
+      </w:r>
+      <w:r>
+        <w:rPr>
+          <w:b/>
+          <w:bCs/>
+        </w:rPr>
+        <w:t>Create</w:t>
+      </w:r>
+      <w:r>
+        <w:t>.</w:t>
       </w:r>
     </w:p>
     <w:p>
       <w:pPr>
         <w:numPr>
           <w:ilvl w:val="0"/>
-          <w:numId w:val="14"/>
+          <w:numId w:val="20"/>
         </w:numPr>
       </w:pPr>
       <w:r>
-        <w:t>Enable Container Support directly within the creation dialog.</w:t>
+        <w:t>Observe the popup error: Could not find a part of the path ".../InteractiveWebAssembly.Client/Properties/launchSettings.json"</w:t>
       </w:r>
     </w:p>
     <w:p>
       <w:pPr>
-        <w:numPr>
-          <w:ilvl w:val="0"/>
-          <w:numId w:val="14"/>
-        </w:numPr>
-      </w:pPr>
-      <w:r>
-        <w:t>Create the project. You will first encounter the following issue:</w:t>
-      </w:r>
-      <w:r>
-        <w:br/>
-        <w:t>Could not find a part of the path "D:\Aug02Sprint\DockerSupport\Repo\Attempt2\BlazorWebApp-ContainerSupport-Validation\ContainerSupport-On-CreationDialog\InteractiveWebAssembly\InteractiveWebAssembly.Client\Properties\launchSettings.json"</w:t>
+        <w:rPr>
+          <w:b/>
+          <w:bCs/>
+        </w:rPr>
+      </w:pPr>
+      <w:r>
+        <w:rPr>
+          <w:b/>
+          <w:bCs/>
+        </w:rPr>
+        <w:t xml:space="preserve">Interactivity </w:t>
+      </w:r>
+      <w:proofErr w:type="spellStart"/>
+      <w:r>
+        <w:rPr>
+          <w:b/>
+          <w:bCs/>
+        </w:rPr>
+        <w:t>WebAsssembly</w:t>
+      </w:r>
+      <w:proofErr w:type="spellEnd"/>
+      <w:r>
+        <w:rPr>
+          <w:b/>
+          <w:bCs/>
+        </w:rPr>
+        <w:t>:</w:t>
       </w:r>
     </w:p>
     <w:p>
       <w:r>
-        <w:rPr>
-          <w:noProof/>
-        </w:rPr>
+        <w:t> </w:t>
+      </w:r>
+    </w:p>
+    <w:p>
+      <w:r>
+        <w:lastRenderedPageBreak/>
         <w:drawing>
-          <wp:inline distT="0" distB="0" distL="0" distR="0" wp14:anchorId="1261DB41" wp14:editId="62C8F4BB">
-            <wp:extent cx="1447800" cy="584200"/>
-            <wp:effectExtent l="0" t="0" r="0" b="6350"/>
-            <wp:docPr id="179060708" name="Picture 16"/>
+          <wp:inline distT="0" distB="0" distL="0" distR="0" wp14:anchorId="648D0A4E" wp14:editId="4BE6DCE3">
+            <wp:extent cx="5943600" cy="2272030"/>
+            <wp:effectExtent l="0" t="0" r="0" b="0"/>
+            <wp:docPr id="666043434" name="Picture 1"/>
             <wp:cNvGraphicFramePr>
               <a:graphicFrameLocks xmlns:a="http://schemas.openxmlformats.org/drawingml/2006/main" noChangeAspect="1"/>
             </wp:cNvGraphicFramePr>
@@ -5060,36 +5141,23 @@
               <a:graphicData uri="http://schemas.openxmlformats.org/drawingml/2006/picture">
                 <pic:pic xmlns:pic="http://schemas.openxmlformats.org/drawingml/2006/picture">
                   <pic:nvPicPr>
-                    <pic:cNvPr id="0" name="Picture 763"/>
-                    <pic:cNvPicPr>
-                      <a:picLocks noChangeAspect="1" noChangeArrowheads="1"/>
-                    </pic:cNvPicPr>
+                    <pic:cNvPr id="666043434" name=""/>
+                    <pic:cNvPicPr/>
                   </pic:nvPicPr>
                   <pic:blipFill>
-                    <a:blip r:embed="rId6" cstate="print">
-                      <a:extLst>
-                        <a:ext uri="{28A0092B-C50C-407E-A947-70E740481C1C}">
-                          <a14:useLocalDpi xmlns:a14="http://schemas.microsoft.com/office/drawing/2010/main" val="0"/>
-                        </a:ext>
-                      </a:extLst>
-                    </a:blip>
-                    <a:srcRect/>
+                    <a:blip r:embed="rId26"/>
                     <a:stretch>
                       <a:fillRect/>
                     </a:stretch>
                   </pic:blipFill>
-                  <pic:spPr bwMode="auto">
+                  <pic:spPr>
                     <a:xfrm>
                       <a:off x="0" y="0"/>
-                      <a:ext cx="1447800" cy="584200"/>
+                      <a:ext cx="5943600" cy="2272030"/>
                     </a:xfrm>
                     <a:prstGeom prst="rect">
                       <a:avLst/>
                     </a:prstGeom>
-                    <a:noFill/>
-                    <a:ln>
-                      <a:noFill/>
-                    </a:ln>
                   </pic:spPr>
                 </pic:pic>
               </a:graphicData>
@@ -5100,31 +5168,26 @@
     </w:p>
     <w:p>
       <w:pPr>
-        <w:numPr>
-          <w:ilvl w:val="0"/>
-          <w:numId w:val="15"/>
-        </w:numPr>
-      </w:pPr>
-      <w:r>
-        <w:t xml:space="preserve">Attempt to build the Docker image </w:t>
-      </w:r>
-      <w:r>
-        <w:t xml:space="preserve">from server project’s Dockerfile </w:t>
-      </w:r>
-      <w:r>
-        <w:t>and observe the COPY path error.</w:t>
+        <w:rPr>
+          <w:b/>
+          <w:bCs/>
+        </w:rPr>
+      </w:pPr>
+      <w:r>
+        <w:rPr>
+          <w:b/>
+          <w:bCs/>
+        </w:rPr>
+        <w:t>Interactive Auto:</w:t>
       </w:r>
     </w:p>
     <w:p>
       <w:r>
-        <w:rPr>
-          <w:noProof/>
-        </w:rPr>
         <w:drawing>
-          <wp:inline distT="0" distB="0" distL="0" distR="0" wp14:anchorId="4F24F67F" wp14:editId="0162F278">
-            <wp:extent cx="1492250" cy="774700"/>
-            <wp:effectExtent l="0" t="0" r="0" b="6350"/>
-            <wp:docPr id="382288866" name="Picture 15"/>
+          <wp:inline distT="0" distB="0" distL="0" distR="0" wp14:anchorId="1CE19C69" wp14:editId="62404E12">
+            <wp:extent cx="5903456" cy="2222626"/>
+            <wp:effectExtent l="0" t="0" r="2540" b="6350"/>
+            <wp:docPr id="1376549971" name="Picture 1"/>
             <wp:cNvGraphicFramePr>
               <a:graphicFrameLocks xmlns:a="http://schemas.openxmlformats.org/drawingml/2006/main" noChangeAspect="1"/>
             </wp:cNvGraphicFramePr>
@@ -5132,36 +5195,23 @@
               <a:graphicData uri="http://schemas.openxmlformats.org/drawingml/2006/picture">
                 <pic:pic xmlns:pic="http://schemas.openxmlformats.org/drawingml/2006/picture">
                   <pic:nvPicPr>
-                    <pic:cNvPr id="0" name="Picture 764"/>
-                    <pic:cNvPicPr>
-                      <a:picLocks noChangeAspect="1" noChangeArrowheads="1"/>
-                    </pic:cNvPicPr>
+                    <pic:cNvPr id="1376549971" name=""/>
+                    <pic:cNvPicPr/>
                   </pic:nvPicPr>
                   <pic:blipFill>
-                    <a:blip r:embed="rId32" cstate="print">
-                      <a:extLst>
-                        <a:ext uri="{28A0092B-C50C-407E-A947-70E740481C1C}">
-                          <a14:useLocalDpi xmlns:a14="http://schemas.microsoft.com/office/drawing/2010/main" val="0"/>
-                        </a:ext>
-                      </a:extLst>
-                    </a:blip>
-                    <a:srcRect/>
+                    <a:blip r:embed="rId27"/>
                     <a:stretch>
                       <a:fillRect/>
                     </a:stretch>
                   </pic:blipFill>
-                  <pic:spPr bwMode="auto">
+                  <pic:spPr>
                     <a:xfrm>
                       <a:off x="0" y="0"/>
-                      <a:ext cx="1492250" cy="774700"/>
+                      <a:ext cx="5915182" cy="2227041"/>
                     </a:xfrm>
                     <a:prstGeom prst="rect">
                       <a:avLst/>
                     </a:prstGeom>
-                    <a:noFill/>
-                    <a:ln>
-                      <a:noFill/>
-                    </a:ln>
                   </pic:spPr>
                 </pic:pic>
               </a:graphicData>
@@ -5171,160 +5221,604 @@
       </w:r>
     </w:p>
     <w:p>
-      <w:r>
-        <w:t> </w:t>
-      </w:r>
-    </w:p>
-    <w:p>
+      <w:pPr>
+        <w:numPr>
+          <w:ilvl w:val="0"/>
+          <w:numId w:val="21"/>
+        </w:numPr>
+      </w:pPr>
+      <w:r>
+        <w:t xml:space="preserve">Click </w:t>
+      </w:r>
       <w:r>
         <w:rPr>
           <w:b/>
           <w:bCs/>
         </w:rPr>
-        <w:t>Scenario B: Via the Project Context Menu</w:t>
+        <w:t>OK</w:t>
+      </w:r>
+      <w:r>
+        <w:t xml:space="preserve"> to dismiss the popup and complete creation. Note that a </w:t>
+      </w:r>
+      <w:proofErr w:type="spellStart"/>
+      <w:r>
+        <w:t>Dockerfile</w:t>
+      </w:r>
+      <w:proofErr w:type="spellEnd"/>
+      <w:r>
+        <w:t xml:space="preserve"> has been generated in both the server and client project folders.</w:t>
       </w:r>
     </w:p>
     <w:p>
       <w:pPr>
-        <w:numPr>
-          <w:ilvl w:val="0"/>
-          <w:numId w:val="16"/>
-        </w:numPr>
-      </w:pPr>
-      <w:r>
-        <w:t>Open an existing Blazor Web App with WebAssembly/Auto render modes.</w:t>
-      </w:r>
-    </w:p>
-    <w:p>
-      <w:pPr>
-        <w:numPr>
-          <w:ilvl w:val="0"/>
-          <w:numId w:val="16"/>
-        </w:numPr>
-      </w:pPr>
-      <w:r>
         <w:rPr>
           <w:b/>
           <w:bCs/>
         </w:rPr>
-        <w:t>Right-click</w:t>
-      </w:r>
-      <w:r>
-        <w:t xml:space="preserve"> the server project in the Solution Explorer.</w:t>
-      </w:r>
-    </w:p>
-    <w:p>
-      <w:pPr>
-        <w:numPr>
-          <w:ilvl w:val="0"/>
-          <w:numId w:val="16"/>
-        </w:numPr>
-      </w:pPr>
-      <w:r>
-        <w:t xml:space="preserve">Select </w:t>
-      </w:r>
+      </w:pPr>
       <w:r>
         <w:rPr>
           <w:b/>
           <w:bCs/>
         </w:rPr>
-        <w:t>Add</w:t>
-      </w:r>
-      <w:r>
-        <w:t xml:space="preserve">, then choose </w:t>
+        <w:t>Evidence:</w:t>
       </w:r>
       <w:r>
         <w:rPr>
           <w:b/>
           <w:bCs/>
         </w:rPr>
-        <w:t>Container Support</w:t>
-      </w:r>
-      <w:r>
-        <w:t>.</w:t>
-      </w:r>
-    </w:p>
-    <w:p>
-      <w:pPr>
-        <w:numPr>
-          <w:ilvl w:val="0"/>
-          <w:numId w:val="16"/>
-        </w:numPr>
-      </w:pPr>
-      <w:r>
-        <w:t>Attempt to build the Docker image and observe the same COPY path error.</w:t>
-      </w:r>
-    </w:p>
-    <w:p>
-      <w:r>
-        <w:rPr>
-          <w:noProof/>
-        </w:rPr>
-        <w:lastRenderedPageBreak/>
-        <w:drawing>
-          <wp:inline distT="0" distB="0" distL="0" distR="0" wp14:anchorId="58115494" wp14:editId="48305613">
-            <wp:extent cx="2819400" cy="1466850"/>
-            <wp:effectExtent l="0" t="0" r="0" b="0"/>
-            <wp:docPr id="540051582" name="Picture 14"/>
-            <wp:cNvGraphicFramePr>
-              <a:graphicFrameLocks xmlns:a="http://schemas.openxmlformats.org/drawingml/2006/main" noChangeAspect="1"/>
-            </wp:cNvGraphicFramePr>
-            <a:graphic xmlns:a="http://schemas.openxmlformats.org/drawingml/2006/main">
-              <a:graphicData uri="http://schemas.openxmlformats.org/drawingml/2006/picture">
-                <pic:pic xmlns:pic="http://schemas.openxmlformats.org/drawingml/2006/picture">
-                  <pic:nvPicPr>
-                    <pic:cNvPr id="0" name="Picture 765"/>
-                    <pic:cNvPicPr>
-                      <a:picLocks noChangeAspect="1" noChangeArrowheads="1"/>
-                    </pic:cNvPicPr>
-                  </pic:nvPicPr>
-                  <pic:blipFill>
-                    <a:blip r:embed="rId33" cstate="print">
-                      <a:extLst>
-                        <a:ext uri="{28A0092B-C50C-407E-A947-70E740481C1C}">
-                          <a14:useLocalDpi xmlns:a14="http://schemas.microsoft.com/office/drawing/2010/main" val="0"/>
-                        </a:ext>
-                      </a:extLst>
-                    </a:blip>
-                    <a:srcRect/>
-                    <a:stretch>
-                      <a:fillRect/>
-                    </a:stretch>
-                  </pic:blipFill>
-                  <pic:spPr bwMode="auto">
-                    <a:xfrm>
-                      <a:off x="0" y="0"/>
-                      <a:ext cx="2819400" cy="1466850"/>
-                    </a:xfrm>
-                    <a:prstGeom prst="rect">
-                      <a:avLst/>
-                    </a:prstGeom>
-                    <a:noFill/>
-                    <a:ln>
-                      <a:noFill/>
-                    </a:ln>
-                  </pic:spPr>
-                </pic:pic>
-              </a:graphicData>
-            </a:graphic>
-          </wp:inline>
-        </w:drawing>
-      </w:r>
-    </w:p>
-    <w:p>
+        <w:br/>
+      </w:r>
       <w:r>
         <w:rPr>
           <w:b/>
           <w:bCs/>
         </w:rPr>
-        <w:t>Additional details</w:t>
-      </w:r>
+        <w:t>Popup error during Blazor Web App creation (WASM/Auto) with Container Support</w:t>
+      </w:r>
+      <w:r>
+        <w:rPr>
+          <w:b/>
+          <w:bCs/>
+        </w:rPr>
+        <w:t xml:space="preserve">: </w:t>
+      </w:r>
+      <w:hyperlink r:id="rId28" w:history="1">
+        <w:r>
+          <w:rPr>
+            <w:rStyle w:val="Hyperlink"/>
+          </w:rPr>
+          <w:t>BlazorWebApp-ContainerSupport-Validation/Evidence/ContainerSupport-On-CreationDialog/blazor-creation-dialog.zip at main · BharatRamsf3693/</w:t>
+        </w:r>
+        <w:proofErr w:type="spellStart"/>
+        <w:r>
+          <w:rPr>
+            <w:rStyle w:val="Hyperlink"/>
+          </w:rPr>
+          <w:t>BlazorWebApp</w:t>
+        </w:r>
+        <w:proofErr w:type="spellEnd"/>
+        <w:r>
+          <w:rPr>
+            <w:rStyle w:val="Hyperlink"/>
+          </w:rPr>
+          <w:t>-</w:t>
+        </w:r>
+        <w:proofErr w:type="spellStart"/>
+        <w:r>
+          <w:rPr>
+            <w:rStyle w:val="Hyperlink"/>
+          </w:rPr>
+          <w:t>ContainerSupport</w:t>
+        </w:r>
+        <w:proofErr w:type="spellEnd"/>
+        <w:r>
+          <w:rPr>
+            <w:rStyle w:val="Hyperlink"/>
+          </w:rPr>
+          <w:t>-Validation</w:t>
+        </w:r>
+      </w:hyperlink>
     </w:p>
     <w:p>
-      <w:r>
-        <w:t>After moving the Dockerfile from the server project folder to the root folder of the project, the COPY path issue was fixed. The image was generated successfully, and it is running fine in the container.</w:t>
+      <w:pPr>
+        <w:rPr>
+          <w:b/>
+          <w:bCs/>
+        </w:rPr>
+      </w:pPr>
+      <w:r>
+        <w:rPr>
+          <w:b/>
+          <w:bCs/>
+        </w:rPr>
+        <w:br/>
+      </w:r>
+      <w:r>
+        <w:rPr>
+          <w:b/>
+          <w:bCs/>
+        </w:rPr>
+        <w:t xml:space="preserve">The Unnecessary </w:t>
+      </w:r>
+      <w:proofErr w:type="spellStart"/>
+      <w:r>
+        <w:rPr>
+          <w:b/>
+          <w:bCs/>
+        </w:rPr>
+        <w:t>Dockerfile</w:t>
+      </w:r>
+      <w:proofErr w:type="spellEnd"/>
+      <w:r>
+        <w:rPr>
+          <w:b/>
+          <w:bCs/>
+        </w:rPr>
+        <w:t xml:space="preserve">: </w:t>
+      </w:r>
+      <w:r>
+        <w:rPr>
+          <w:b/>
+          <w:bCs/>
+        </w:rPr>
+        <w:br/>
+        <w:t xml:space="preserve">Interactive </w:t>
+      </w:r>
+      <w:proofErr w:type="spellStart"/>
+      <w:r>
+        <w:rPr>
+          <w:b/>
+          <w:bCs/>
+        </w:rPr>
+        <w:t>WebAssembly</w:t>
+      </w:r>
+      <w:proofErr w:type="spellEnd"/>
+      <w:r>
+        <w:rPr>
+          <w:b/>
+          <w:bCs/>
+        </w:rPr>
+        <w:t xml:space="preserve">: </w:t>
+      </w:r>
+      <w:hyperlink r:id="rId29" w:history="1">
+        <w:r>
+          <w:rPr>
+            <w:rStyle w:val="Hyperlink"/>
+          </w:rPr>
+          <w:t xml:space="preserve">BlazorWebApp-ContainerSupport-Validation/ContainerSupport-On-CreationDialog/InteractiveWebAssembly/InteractiveWebAssembly.Client/Dockerfile at </w:t>
+        </w:r>
+        <w:r>
+          <w:rPr>
+            <w:rStyle w:val="Hyperlink"/>
+          </w:rPr>
+          <w:lastRenderedPageBreak/>
+          <w:t>main · BharatRamsf3693/</w:t>
+        </w:r>
+        <w:proofErr w:type="spellStart"/>
+        <w:r>
+          <w:rPr>
+            <w:rStyle w:val="Hyperlink"/>
+          </w:rPr>
+          <w:t>BlazorWebApp</w:t>
+        </w:r>
+        <w:proofErr w:type="spellEnd"/>
+        <w:r>
+          <w:rPr>
+            <w:rStyle w:val="Hyperlink"/>
+          </w:rPr>
+          <w:t>-</w:t>
+        </w:r>
+        <w:proofErr w:type="spellStart"/>
+        <w:r>
+          <w:rPr>
+            <w:rStyle w:val="Hyperlink"/>
+          </w:rPr>
+          <w:t>ContainerSupport</w:t>
+        </w:r>
+        <w:proofErr w:type="spellEnd"/>
+        <w:r>
+          <w:rPr>
+            <w:rStyle w:val="Hyperlink"/>
+          </w:rPr>
+          <w:t>-Validation</w:t>
+        </w:r>
+      </w:hyperlink>
+      <w:r>
+        <w:rPr>
+          <w:b/>
+          <w:bCs/>
+        </w:rPr>
+        <w:br/>
       </w:r>
     </w:p>
+    <w:p>
+      <w:pPr>
+        <w:rPr>
+          <w:b/>
+          <w:bCs/>
+        </w:rPr>
+      </w:pPr>
+      <w:r>
+        <w:rPr>
+          <w:b/>
+          <w:bCs/>
+        </w:rPr>
+        <w:t xml:space="preserve">Interactive </w:t>
+      </w:r>
+      <w:r>
+        <w:rPr>
+          <w:b/>
+          <w:bCs/>
+        </w:rPr>
+        <w:t>Auto</w:t>
+      </w:r>
+      <w:r>
+        <w:rPr>
+          <w:b/>
+          <w:bCs/>
+        </w:rPr>
+        <w:t xml:space="preserve">: </w:t>
+      </w:r>
+      <w:hyperlink r:id="rId30" w:history="1">
+        <w:r>
+          <w:rPr>
+            <w:rStyle w:val="Hyperlink"/>
+          </w:rPr>
+          <w:t>BlazorWebApp-ContainerSupport-Validation/ContainerSupport-On-CreationDialog/InteractiveAuto/InteractiveAuto.Client/Dockerfile at main · BharatRamsf3693/</w:t>
+        </w:r>
+        <w:proofErr w:type="spellStart"/>
+        <w:r>
+          <w:rPr>
+            <w:rStyle w:val="Hyperlink"/>
+          </w:rPr>
+          <w:t>BlazorWebApp</w:t>
+        </w:r>
+        <w:proofErr w:type="spellEnd"/>
+        <w:r>
+          <w:rPr>
+            <w:rStyle w:val="Hyperlink"/>
+          </w:rPr>
+          <w:t>-</w:t>
+        </w:r>
+        <w:proofErr w:type="spellStart"/>
+        <w:r>
+          <w:rPr>
+            <w:rStyle w:val="Hyperlink"/>
+          </w:rPr>
+          <w:t>ContainerSupport</w:t>
+        </w:r>
+        <w:proofErr w:type="spellEnd"/>
+        <w:r>
+          <w:rPr>
+            <w:rStyle w:val="Hyperlink"/>
+          </w:rPr>
+          <w:t>-Validation</w:t>
+        </w:r>
+      </w:hyperlink>
+      <w:r>
+        <w:br/>
+      </w:r>
+      <w:r>
+        <w:br/>
+      </w:r>
+      <w:r>
+        <w:rPr>
+          <w:b/>
+          <w:bCs/>
+        </w:rPr>
+        <w:t>Observation:</w:t>
+      </w:r>
+      <w:r>
+        <w:rPr>
+          <w:b/>
+          <w:bCs/>
+        </w:rPr>
+        <w:br/>
+      </w:r>
+      <w:r>
+        <w:rPr>
+          <w:b/>
+          <w:bCs/>
+        </w:rPr>
+        <w:t>Short Summary</w:t>
+      </w:r>
+    </w:p>
+    <w:p>
+      <w:r>
+        <w:t xml:space="preserve">This issue occurs in both Interactive </w:t>
+      </w:r>
+      <w:proofErr w:type="spellStart"/>
+      <w:r>
+        <w:t>WebAssembly</w:t>
+      </w:r>
+      <w:proofErr w:type="spellEnd"/>
+      <w:r>
+        <w:t xml:space="preserve"> and Auto interactive render modes. The Docker image fails to generate when running the build command directly within the server project directory:</w:t>
+      </w:r>
+    </w:p>
+    <w:p>
+      <w:r>
+        <w:t>docker build -t interactive-</w:t>
+      </w:r>
+      <w:proofErr w:type="spellStart"/>
+      <w:proofErr w:type="gramStart"/>
+      <w:r>
+        <w:t>webassembly</w:t>
+      </w:r>
+      <w:proofErr w:type="spellEnd"/>
+      <w:r>
+        <w:t xml:space="preserve"> .</w:t>
+      </w:r>
+      <w:proofErr w:type="gramEnd"/>
+    </w:p>
+    <w:p>
+      <w:r>
+        <w:t>However, the image generates successfully when the command is run from the solution folder using the -f flag:</w:t>
+      </w:r>
+    </w:p>
+    <w:p>
+      <w:r>
+        <w:t xml:space="preserve">docker build -f </w:t>
+      </w:r>
+      <w:proofErr w:type="spellStart"/>
+      <w:r>
+        <w:t>InteractiveWebAssembly</w:t>
+      </w:r>
+      <w:proofErr w:type="spellEnd"/>
+      <w:r>
+        <w:t>/</w:t>
+      </w:r>
+      <w:proofErr w:type="spellStart"/>
+      <w:r>
+        <w:t>Dockerfile</w:t>
+      </w:r>
+      <w:proofErr w:type="spellEnd"/>
+      <w:r>
+        <w:t xml:space="preserve"> -t interactive-</w:t>
+      </w:r>
+      <w:proofErr w:type="spellStart"/>
+      <w:proofErr w:type="gramStart"/>
+      <w:r>
+        <w:t>webassembly</w:t>
+      </w:r>
+      <w:proofErr w:type="spellEnd"/>
+      <w:r>
+        <w:t xml:space="preserve"> .</w:t>
+      </w:r>
+      <w:proofErr w:type="gramEnd"/>
+    </w:p>
+    <w:p>
+      <w:pPr>
+        <w:rPr>
+          <w:b/>
+          <w:bCs/>
+        </w:rPr>
+      </w:pPr>
+      <w:r>
+        <w:rPr>
+          <w:b/>
+          <w:bCs/>
+        </w:rPr>
+        <w:t>What Happened</w:t>
+      </w:r>
+    </w:p>
+    <w:p>
+      <w:r>
+        <w:t xml:space="preserve">When attempting to build the Docker image from inside the server project directory, the docker build command failed with a context or file path error. This occurs because the generated </w:t>
+      </w:r>
+      <w:proofErr w:type="spellStart"/>
+      <w:r>
+        <w:t>Dockerfile</w:t>
+      </w:r>
+      <w:proofErr w:type="spellEnd"/>
+      <w:r>
+        <w:t xml:space="preserve"> expects the build context to be the root solution folder, meaning it cannot locate the necessary project dependencies or reference files when executed from the subdirectory.</w:t>
+      </w:r>
+    </w:p>
+    <w:p>
+      <w:pPr>
+        <w:rPr>
+          <w:b/>
+          <w:bCs/>
+        </w:rPr>
+      </w:pPr>
+      <w:r>
+        <w:rPr>
+          <w:b/>
+          <w:bCs/>
+        </w:rPr>
+        <w:t>Steps to Reproduce</w:t>
+      </w:r>
+    </w:p>
+    <w:p>
+      <w:pPr>
+        <w:numPr>
+          <w:ilvl w:val="0"/>
+          <w:numId w:val="22"/>
+        </w:numPr>
+      </w:pPr>
+      <w:r>
+        <w:t>Open Visual Studio 2026 Insider.</w:t>
+      </w:r>
+    </w:p>
+    <w:p>
+      <w:pPr>
+        <w:numPr>
+          <w:ilvl w:val="0"/>
+          <w:numId w:val="22"/>
+        </w:numPr>
+      </w:pPr>
+      <w:r>
+        <w:t>Create a new Blazor Web App using the project creation wizard.</w:t>
+      </w:r>
+    </w:p>
+    <w:p>
+      <w:pPr>
+        <w:numPr>
+          <w:ilvl w:val="0"/>
+          <w:numId w:val="22"/>
+        </w:numPr>
+      </w:pPr>
+      <w:r>
+        <w:t xml:space="preserve">Select either the Interactive </w:t>
+      </w:r>
+      <w:proofErr w:type="spellStart"/>
+      <w:r>
+        <w:t>WebAssembly</w:t>
+      </w:r>
+      <w:proofErr w:type="spellEnd"/>
+      <w:r>
+        <w:t xml:space="preserve"> or Auto interactive render mode.</w:t>
+      </w:r>
+    </w:p>
+    <w:p>
+      <w:pPr>
+        <w:numPr>
+          <w:ilvl w:val="0"/>
+          <w:numId w:val="22"/>
+        </w:numPr>
+      </w:pPr>
+      <w:r>
+        <w:t>Enable Container Support directly within the creation dialog (or right-click the server project after creation and add container support).</w:t>
+      </w:r>
+    </w:p>
+    <w:p>
+      <w:pPr>
+        <w:numPr>
+          <w:ilvl w:val="0"/>
+          <w:numId w:val="22"/>
+        </w:numPr>
+      </w:pPr>
+      <w:r>
+        <w:t>Create the project.</w:t>
+      </w:r>
+    </w:p>
+    <w:p>
+      <w:pPr>
+        <w:numPr>
+          <w:ilvl w:val="0"/>
+          <w:numId w:val="22"/>
+        </w:numPr>
+      </w:pPr>
+      <w:r>
+        <w:t>Open a command prompt and navigate to the server project directory.</w:t>
+      </w:r>
+    </w:p>
+    <w:p>
+      <w:pPr>
+        <w:numPr>
+          <w:ilvl w:val="0"/>
+          <w:numId w:val="22"/>
+        </w:numPr>
+      </w:pPr>
+      <w:r>
+        <w:t>Run the following command to generate the Docker image:</w:t>
+      </w:r>
+      <w:r>
+        <w:br/>
+        <w:t>docker build -t interactive-</w:t>
+      </w:r>
+      <w:proofErr w:type="spellStart"/>
+      <w:proofErr w:type="gramStart"/>
+      <w:r>
+        <w:t>webassembly</w:t>
+      </w:r>
+      <w:proofErr w:type="spellEnd"/>
+      <w:r>
+        <w:t xml:space="preserve"> .</w:t>
+      </w:r>
+      <w:proofErr w:type="gramEnd"/>
+    </w:p>
+    <w:p>
+      <w:pPr>
+        <w:rPr>
+          <w:b/>
+          <w:bCs/>
+        </w:rPr>
+      </w:pPr>
+      <w:r>
+        <w:rPr>
+          <w:b/>
+          <w:bCs/>
+        </w:rPr>
+        <w:lastRenderedPageBreak/>
+        <w:t>Evidence:</w:t>
+      </w:r>
+      <w:r>
+        <w:rPr>
+          <w:b/>
+          <w:bCs/>
+        </w:rPr>
+        <w:t xml:space="preserve"> </w:t>
+      </w:r>
+    </w:p>
+    <w:p>
+      <w:r>
+        <w:rPr>
+          <w:b/>
+          <w:bCs/>
+        </w:rPr>
+        <w:t xml:space="preserve">Interactive </w:t>
+      </w:r>
+      <w:proofErr w:type="spellStart"/>
+      <w:r>
+        <w:rPr>
+          <w:b/>
+          <w:bCs/>
+        </w:rPr>
+        <w:t>WebAssembly</w:t>
+      </w:r>
+      <w:proofErr w:type="spellEnd"/>
+      <w:r>
+        <w:rPr>
+          <w:b/>
+          <w:bCs/>
+        </w:rPr>
+        <w:t xml:space="preserve">: </w:t>
+      </w:r>
+      <w:hyperlink r:id="rId31" w:history="1">
+        <w:r>
+          <w:rPr>
+            <w:rStyle w:val="Hyperlink"/>
+          </w:rPr>
+          <w:t>InteractiveWebAssemby.png</w:t>
+        </w:r>
+      </w:hyperlink>
+    </w:p>
+    <w:p>
+      <w:pPr>
+        <w:rPr>
+          <w:b/>
+          <w:bCs/>
+        </w:rPr>
+      </w:pPr>
+      <w:r>
+        <w:rPr>
+          <w:b/>
+          <w:bCs/>
+        </w:rPr>
+        <w:t xml:space="preserve">Interactive Auto: </w:t>
+      </w:r>
+      <w:hyperlink r:id="rId32" w:history="1">
+        <w:r>
+          <w:rPr>
+            <w:rStyle w:val="Hyperlink"/>
+          </w:rPr>
+          <w:t>InteractiveAuto.png</w:t>
+        </w:r>
+      </w:hyperlink>
+    </w:p>
+    <w:p>
+      <w:pPr>
+        <w:rPr>
+          <w:b/>
+          <w:bCs/>
+        </w:rPr>
+      </w:pPr>
+    </w:p>
+    <w:p/>
     <w:sectPr>
       <w:pgSz w:w="12240" w:h="15840"/>
       <w:pgMar w:top="1440" w:right="1440" w:bottom="1440" w:left="1440" w:header="720" w:footer="720" w:gutter="0"/>
@@ -6905,6 +7399,155 @@
     </w:lvl>
   </w:abstractNum>
   <w:abstractNum w:abstractNumId="11" w15:restartNumberingAfterBreak="0">
+    <w:nsid w:val="39507504"/>
+    <w:multiLevelType w:val="multilevel"/>
+    <w:tmpl w:val="DD94F910"/>
+    <w:lvl w:ilvl="0">
+      <w:start w:val="1"/>
+      <w:numFmt w:val="bullet"/>
+      <w:lvlText w:val=""/>
+      <w:lvlJc w:val="left"/>
+      <w:pPr>
+        <w:tabs>
+          <w:tab w:val="num" w:pos="720"/>
+        </w:tabs>
+        <w:ind w:left="720" w:hanging="360"/>
+      </w:pPr>
+      <w:rPr>
+        <w:rFonts w:ascii="Symbol" w:hAnsi="Symbol" w:hint="default"/>
+        <w:sz w:val="20"/>
+      </w:rPr>
+    </w:lvl>
+    <w:lvl w:ilvl="1" w:tentative="1">
+      <w:start w:val="1"/>
+      <w:numFmt w:val="bullet"/>
+      <w:lvlText w:val=""/>
+      <w:lvlJc w:val="left"/>
+      <w:pPr>
+        <w:tabs>
+          <w:tab w:val="num" w:pos="1440"/>
+        </w:tabs>
+        <w:ind w:left="1440" w:hanging="360"/>
+      </w:pPr>
+      <w:rPr>
+        <w:rFonts w:ascii="Symbol" w:hAnsi="Symbol" w:hint="default"/>
+        <w:sz w:val="20"/>
+      </w:rPr>
+    </w:lvl>
+    <w:lvl w:ilvl="2" w:tentative="1">
+      <w:start w:val="1"/>
+      <w:numFmt w:val="bullet"/>
+      <w:lvlText w:val=""/>
+      <w:lvlJc w:val="left"/>
+      <w:pPr>
+        <w:tabs>
+          <w:tab w:val="num" w:pos="2160"/>
+        </w:tabs>
+        <w:ind w:left="2160" w:hanging="360"/>
+      </w:pPr>
+      <w:rPr>
+        <w:rFonts w:ascii="Symbol" w:hAnsi="Symbol" w:hint="default"/>
+        <w:sz w:val="20"/>
+      </w:rPr>
+    </w:lvl>
+    <w:lvl w:ilvl="3" w:tentative="1">
+      <w:start w:val="1"/>
+      <w:numFmt w:val="bullet"/>
+      <w:lvlText w:val=""/>
+      <w:lvlJc w:val="left"/>
+      <w:pPr>
+        <w:tabs>
+          <w:tab w:val="num" w:pos="2880"/>
+        </w:tabs>
+        <w:ind w:left="2880" w:hanging="360"/>
+      </w:pPr>
+      <w:rPr>
+        <w:rFonts w:ascii="Symbol" w:hAnsi="Symbol" w:hint="default"/>
+        <w:sz w:val="20"/>
+      </w:rPr>
+    </w:lvl>
+    <w:lvl w:ilvl="4" w:tentative="1">
+      <w:start w:val="1"/>
+      <w:numFmt w:val="bullet"/>
+      <w:lvlText w:val=""/>
+      <w:lvlJc w:val="left"/>
+      <w:pPr>
+        <w:tabs>
+          <w:tab w:val="num" w:pos="3600"/>
+        </w:tabs>
+        <w:ind w:left="3600" w:hanging="360"/>
+      </w:pPr>
+      <w:rPr>
+        <w:rFonts w:ascii="Symbol" w:hAnsi="Symbol" w:hint="default"/>
+        <w:sz w:val="20"/>
+      </w:rPr>
+    </w:lvl>
+    <w:lvl w:ilvl="5" w:tentative="1">
+      <w:start w:val="1"/>
+      <w:numFmt w:val="bullet"/>
+      <w:lvlText w:val=""/>
+      <w:lvlJc w:val="left"/>
+      <w:pPr>
+        <w:tabs>
+          <w:tab w:val="num" w:pos="4320"/>
+        </w:tabs>
+        <w:ind w:left="4320" w:hanging="360"/>
+      </w:pPr>
+      <w:rPr>
+        <w:rFonts w:ascii="Symbol" w:hAnsi="Symbol" w:hint="default"/>
+        <w:sz w:val="20"/>
+      </w:rPr>
+    </w:lvl>
+    <w:lvl w:ilvl="6" w:tentative="1">
+      <w:start w:val="1"/>
+      <w:numFmt w:val="bullet"/>
+      <w:lvlText w:val=""/>
+      <w:lvlJc w:val="left"/>
+      <w:pPr>
+        <w:tabs>
+          <w:tab w:val="num" w:pos="5040"/>
+        </w:tabs>
+        <w:ind w:left="5040" w:hanging="360"/>
+      </w:pPr>
+      <w:rPr>
+        <w:rFonts w:ascii="Symbol" w:hAnsi="Symbol" w:hint="default"/>
+        <w:sz w:val="20"/>
+      </w:rPr>
+    </w:lvl>
+    <w:lvl w:ilvl="7" w:tentative="1">
+      <w:start w:val="1"/>
+      <w:numFmt w:val="bullet"/>
+      <w:lvlText w:val=""/>
+      <w:lvlJc w:val="left"/>
+      <w:pPr>
+        <w:tabs>
+          <w:tab w:val="num" w:pos="5760"/>
+        </w:tabs>
+        <w:ind w:left="5760" w:hanging="360"/>
+      </w:pPr>
+      <w:rPr>
+        <w:rFonts w:ascii="Symbol" w:hAnsi="Symbol" w:hint="default"/>
+        <w:sz w:val="20"/>
+      </w:rPr>
+    </w:lvl>
+    <w:lvl w:ilvl="8" w:tentative="1">
+      <w:start w:val="1"/>
+      <w:numFmt w:val="bullet"/>
+      <w:lvlText w:val=""/>
+      <w:lvlJc w:val="left"/>
+      <w:pPr>
+        <w:tabs>
+          <w:tab w:val="num" w:pos="6480"/>
+        </w:tabs>
+        <w:ind w:left="6480" w:hanging="360"/>
+      </w:pPr>
+      <w:rPr>
+        <w:rFonts w:ascii="Symbol" w:hAnsi="Symbol" w:hint="default"/>
+        <w:sz w:val="20"/>
+      </w:rPr>
+    </w:lvl>
+  </w:abstractNum>
+  <w:abstractNum w:abstractNumId="12" w15:restartNumberingAfterBreak="0">
     <w:nsid w:val="46CF3200"/>
     <w:multiLevelType w:val="multilevel"/>
     <w:tmpl w:val="F2EC131A"/>
@@ -7053,7 +7696,7 @@
       </w:rPr>
     </w:lvl>
   </w:abstractNum>
-  <w:abstractNum w:abstractNumId="12" w15:restartNumberingAfterBreak="0">
+  <w:abstractNum w:abstractNumId="13" w15:restartNumberingAfterBreak="0">
     <w:nsid w:val="58602A1D"/>
     <w:multiLevelType w:val="multilevel"/>
     <w:tmpl w:val="AFC0CA20"/>
@@ -7202,7 +7845,120 @@
       </w:rPr>
     </w:lvl>
   </w:abstractNum>
-  <w:abstractNum w:abstractNumId="13" w15:restartNumberingAfterBreak="0">
+  <w:abstractNum w:abstractNumId="14" w15:restartNumberingAfterBreak="0">
+    <w:nsid w:val="586F5985"/>
+    <w:multiLevelType w:val="multilevel"/>
+    <w:tmpl w:val="1E3A1C92"/>
+    <w:lvl w:ilvl="0">
+      <w:start w:val="1"/>
+      <w:numFmt w:val="decimal"/>
+      <w:lvlText w:val="%1."/>
+      <w:lvlJc w:val="left"/>
+      <w:pPr>
+        <w:tabs>
+          <w:tab w:val="num" w:pos="720"/>
+        </w:tabs>
+        <w:ind w:left="720" w:hanging="360"/>
+      </w:pPr>
+    </w:lvl>
+    <w:lvl w:ilvl="1" w:tentative="1">
+      <w:start w:val="1"/>
+      <w:numFmt w:val="decimal"/>
+      <w:lvlText w:val="%2."/>
+      <w:lvlJc w:val="left"/>
+      <w:pPr>
+        <w:tabs>
+          <w:tab w:val="num" w:pos="1440"/>
+        </w:tabs>
+        <w:ind w:left="1440" w:hanging="360"/>
+      </w:pPr>
+    </w:lvl>
+    <w:lvl w:ilvl="2" w:tentative="1">
+      <w:start w:val="1"/>
+      <w:numFmt w:val="decimal"/>
+      <w:lvlText w:val="%3."/>
+      <w:lvlJc w:val="left"/>
+      <w:pPr>
+        <w:tabs>
+          <w:tab w:val="num" w:pos="2160"/>
+        </w:tabs>
+        <w:ind w:left="2160" w:hanging="360"/>
+      </w:pPr>
+    </w:lvl>
+    <w:lvl w:ilvl="3" w:tentative="1">
+      <w:start w:val="1"/>
+      <w:numFmt w:val="decimal"/>
+      <w:lvlText w:val="%4."/>
+      <w:lvlJc w:val="left"/>
+      <w:pPr>
+        <w:tabs>
+          <w:tab w:val="num" w:pos="2880"/>
+        </w:tabs>
+        <w:ind w:left="2880" w:hanging="360"/>
+      </w:pPr>
+    </w:lvl>
+    <w:lvl w:ilvl="4" w:tentative="1">
+      <w:start w:val="1"/>
+      <w:numFmt w:val="decimal"/>
+      <w:lvlText w:val="%5."/>
+      <w:lvlJc w:val="left"/>
+      <w:pPr>
+        <w:tabs>
+          <w:tab w:val="num" w:pos="3600"/>
+        </w:tabs>
+        <w:ind w:left="3600" w:hanging="360"/>
+      </w:pPr>
+    </w:lvl>
+    <w:lvl w:ilvl="5" w:tentative="1">
+      <w:start w:val="1"/>
+      <w:numFmt w:val="decimal"/>
+      <w:lvlText w:val="%6."/>
+      <w:lvlJc w:val="left"/>
+      <w:pPr>
+        <w:tabs>
+          <w:tab w:val="num" w:pos="4320"/>
+        </w:tabs>
+        <w:ind w:left="4320" w:hanging="360"/>
+      </w:pPr>
+    </w:lvl>
+    <w:lvl w:ilvl="6" w:tentative="1">
+      <w:start w:val="1"/>
+      <w:numFmt w:val="decimal"/>
+      <w:lvlText w:val="%7."/>
+      <w:lvlJc w:val="left"/>
+      <w:pPr>
+        <w:tabs>
+          <w:tab w:val="num" w:pos="5040"/>
+        </w:tabs>
+        <w:ind w:left="5040" w:hanging="360"/>
+      </w:pPr>
+    </w:lvl>
+    <w:lvl w:ilvl="7" w:tentative="1">
+      <w:start w:val="1"/>
+      <w:numFmt w:val="decimal"/>
+      <w:lvlText w:val="%8."/>
+      <w:lvlJc w:val="left"/>
+      <w:pPr>
+        <w:tabs>
+          <w:tab w:val="num" w:pos="5760"/>
+        </w:tabs>
+        <w:ind w:left="5760" w:hanging="360"/>
+      </w:pPr>
+    </w:lvl>
+    <w:lvl w:ilvl="8" w:tentative="1">
+      <w:start w:val="1"/>
+      <w:numFmt w:val="decimal"/>
+      <w:lvlText w:val="%9."/>
+      <w:lvlJc w:val="left"/>
+      <w:pPr>
+        <w:tabs>
+          <w:tab w:val="num" w:pos="6480"/>
+        </w:tabs>
+        <w:ind w:left="6480" w:hanging="360"/>
+      </w:pPr>
+    </w:lvl>
+  </w:abstractNum>
+  <w:abstractNum w:abstractNumId="15" w15:restartNumberingAfterBreak="0">
     <w:nsid w:val="5D4B4817"/>
     <w:multiLevelType w:val="multilevel"/>
     <w:tmpl w:val="DA78E94A"/>
@@ -7351,7 +8107,269 @@
       </w:rPr>
     </w:lvl>
   </w:abstractNum>
-  <w:abstractNum w:abstractNumId="14" w15:restartNumberingAfterBreak="0">
+  <w:abstractNum w:abstractNumId="16" w15:restartNumberingAfterBreak="0">
+    <w:nsid w:val="5DC21EB9"/>
+    <w:multiLevelType w:val="multilevel"/>
+    <w:tmpl w:val="B94054CE"/>
+    <w:lvl w:ilvl="0">
+      <w:start w:val="1"/>
+      <w:numFmt w:val="decimal"/>
+      <w:lvlText w:val="%1."/>
+      <w:lvlJc w:val="left"/>
+      <w:pPr>
+        <w:tabs>
+          <w:tab w:val="num" w:pos="720"/>
+        </w:tabs>
+        <w:ind w:left="720" w:hanging="360"/>
+      </w:pPr>
+    </w:lvl>
+    <w:lvl w:ilvl="1" w:tentative="1">
+      <w:start w:val="1"/>
+      <w:numFmt w:val="decimal"/>
+      <w:lvlText w:val="%2."/>
+      <w:lvlJc w:val="left"/>
+      <w:pPr>
+        <w:tabs>
+          <w:tab w:val="num" w:pos="1440"/>
+        </w:tabs>
+        <w:ind w:left="1440" w:hanging="360"/>
+      </w:pPr>
+    </w:lvl>
+    <w:lvl w:ilvl="2" w:tentative="1">
+      <w:start w:val="1"/>
+      <w:numFmt w:val="decimal"/>
+      <w:lvlText w:val="%3."/>
+      <w:lvlJc w:val="left"/>
+      <w:pPr>
+        <w:tabs>
+          <w:tab w:val="num" w:pos="2160"/>
+        </w:tabs>
+        <w:ind w:left="2160" w:hanging="360"/>
+      </w:pPr>
+    </w:lvl>
+    <w:lvl w:ilvl="3" w:tentative="1">
+      <w:start w:val="1"/>
+      <w:numFmt w:val="decimal"/>
+      <w:lvlText w:val="%4."/>
+      <w:lvlJc w:val="left"/>
+      <w:pPr>
+        <w:tabs>
+          <w:tab w:val="num" w:pos="2880"/>
+        </w:tabs>
+        <w:ind w:left="2880" w:hanging="360"/>
+      </w:pPr>
+    </w:lvl>
+    <w:lvl w:ilvl="4" w:tentative="1">
+      <w:start w:val="1"/>
+      <w:numFmt w:val="decimal"/>
+      <w:lvlText w:val="%5."/>
+      <w:lvlJc w:val="left"/>
+      <w:pPr>
+        <w:tabs>
+          <w:tab w:val="num" w:pos="3600"/>
+        </w:tabs>
+        <w:ind w:left="3600" w:hanging="360"/>
+      </w:pPr>
+    </w:lvl>
+    <w:lvl w:ilvl="5" w:tentative="1">
+      <w:start w:val="1"/>
+      <w:numFmt w:val="decimal"/>
+      <w:lvlText w:val="%6."/>
+      <w:lvlJc w:val="left"/>
+      <w:pPr>
+        <w:tabs>
+          <w:tab w:val="num" w:pos="4320"/>
+        </w:tabs>
+        <w:ind w:left="4320" w:hanging="360"/>
+      </w:pPr>
+    </w:lvl>
+    <w:lvl w:ilvl="6" w:tentative="1">
+      <w:start w:val="1"/>
+      <w:numFmt w:val="decimal"/>
+      <w:lvlText w:val="%7."/>
+      <w:lvlJc w:val="left"/>
+      <w:pPr>
+        <w:tabs>
+          <w:tab w:val="num" w:pos="5040"/>
+        </w:tabs>
+        <w:ind w:left="5040" w:hanging="360"/>
+      </w:pPr>
+    </w:lvl>
+    <w:lvl w:ilvl="7" w:tentative="1">
+      <w:start w:val="1"/>
+      <w:numFmt w:val="decimal"/>
+      <w:lvlText w:val="%8."/>
+      <w:lvlJc w:val="left"/>
+      <w:pPr>
+        <w:tabs>
+          <w:tab w:val="num" w:pos="5760"/>
+        </w:tabs>
+        <w:ind w:left="5760" w:hanging="360"/>
+      </w:pPr>
+    </w:lvl>
+    <w:lvl w:ilvl="8" w:tentative="1">
+      <w:start w:val="1"/>
+      <w:numFmt w:val="decimal"/>
+      <w:lvlText w:val="%9."/>
+      <w:lvlJc w:val="left"/>
+      <w:pPr>
+        <w:tabs>
+          <w:tab w:val="num" w:pos="6480"/>
+        </w:tabs>
+        <w:ind w:left="6480" w:hanging="360"/>
+      </w:pPr>
+    </w:lvl>
+  </w:abstractNum>
+  <w:abstractNum w:abstractNumId="17" w15:restartNumberingAfterBreak="0">
+    <w:nsid w:val="5DDC0C44"/>
+    <w:multiLevelType w:val="multilevel"/>
+    <w:tmpl w:val="9AA88A3C"/>
+    <w:lvl w:ilvl="0">
+      <w:start w:val="1"/>
+      <w:numFmt w:val="bullet"/>
+      <w:lvlText w:val=""/>
+      <w:lvlJc w:val="left"/>
+      <w:pPr>
+        <w:tabs>
+          <w:tab w:val="num" w:pos="720"/>
+        </w:tabs>
+        <w:ind w:left="720" w:hanging="360"/>
+      </w:pPr>
+      <w:rPr>
+        <w:rFonts w:ascii="Symbol" w:hAnsi="Symbol" w:hint="default"/>
+        <w:sz w:val="20"/>
+      </w:rPr>
+    </w:lvl>
+    <w:lvl w:ilvl="1" w:tentative="1">
+      <w:start w:val="1"/>
+      <w:numFmt w:val="bullet"/>
+      <w:lvlText w:val=""/>
+      <w:lvlJc w:val="left"/>
+      <w:pPr>
+        <w:tabs>
+          <w:tab w:val="num" w:pos="1440"/>
+        </w:tabs>
+        <w:ind w:left="1440" w:hanging="360"/>
+      </w:pPr>
+      <w:rPr>
+        <w:rFonts w:ascii="Symbol" w:hAnsi="Symbol" w:hint="default"/>
+        <w:sz w:val="20"/>
+      </w:rPr>
+    </w:lvl>
+    <w:lvl w:ilvl="2" w:tentative="1">
+      <w:start w:val="1"/>
+      <w:numFmt w:val="bullet"/>
+      <w:lvlText w:val=""/>
+      <w:lvlJc w:val="left"/>
+      <w:pPr>
+        <w:tabs>
+          <w:tab w:val="num" w:pos="2160"/>
+        </w:tabs>
+        <w:ind w:left="2160" w:hanging="360"/>
+      </w:pPr>
+      <w:rPr>
+        <w:rFonts w:ascii="Symbol" w:hAnsi="Symbol" w:hint="default"/>
+        <w:sz w:val="20"/>
+      </w:rPr>
+    </w:lvl>
+    <w:lvl w:ilvl="3" w:tentative="1">
+      <w:start w:val="1"/>
+      <w:numFmt w:val="bullet"/>
+      <w:lvlText w:val=""/>
+      <w:lvlJc w:val="left"/>
+      <w:pPr>
+        <w:tabs>
+          <w:tab w:val="num" w:pos="2880"/>
+        </w:tabs>
+        <w:ind w:left="2880" w:hanging="360"/>
+      </w:pPr>
+      <w:rPr>
+        <w:rFonts w:ascii="Symbol" w:hAnsi="Symbol" w:hint="default"/>
+        <w:sz w:val="20"/>
+      </w:rPr>
+    </w:lvl>
+    <w:lvl w:ilvl="4" w:tentative="1">
+      <w:start w:val="1"/>
+      <w:numFmt w:val="bullet"/>
+      <w:lvlText w:val=""/>
+      <w:lvlJc w:val="left"/>
+      <w:pPr>
+        <w:tabs>
+          <w:tab w:val="num" w:pos="3600"/>
+        </w:tabs>
+        <w:ind w:left="3600" w:hanging="360"/>
+      </w:pPr>
+      <w:rPr>
+        <w:rFonts w:ascii="Symbol" w:hAnsi="Symbol" w:hint="default"/>
+        <w:sz w:val="20"/>
+      </w:rPr>
+    </w:lvl>
+    <w:lvl w:ilvl="5" w:tentative="1">
+      <w:start w:val="1"/>
+      <w:numFmt w:val="bullet"/>
+      <w:lvlText w:val=""/>
+      <w:lvlJc w:val="left"/>
+      <w:pPr>
+        <w:tabs>
+          <w:tab w:val="num" w:pos="4320"/>
+        </w:tabs>
+        <w:ind w:left="4320" w:hanging="360"/>
+      </w:pPr>
+      <w:rPr>
+        <w:rFonts w:ascii="Symbol" w:hAnsi="Symbol" w:hint="default"/>
+        <w:sz w:val="20"/>
+      </w:rPr>
+    </w:lvl>
+    <w:lvl w:ilvl="6" w:tentative="1">
+      <w:start w:val="1"/>
+      <w:numFmt w:val="bullet"/>
+      <w:lvlText w:val=""/>
+      <w:lvlJc w:val="left"/>
+      <w:pPr>
+        <w:tabs>
+          <w:tab w:val="num" w:pos="5040"/>
+        </w:tabs>
+        <w:ind w:left="5040" w:hanging="360"/>
+      </w:pPr>
+      <w:rPr>
+        <w:rFonts w:ascii="Symbol" w:hAnsi="Symbol" w:hint="default"/>
+        <w:sz w:val="20"/>
+      </w:rPr>
+    </w:lvl>
+    <w:lvl w:ilvl="7" w:tentative="1">
+      <w:start w:val="1"/>
+      <w:numFmt w:val="bullet"/>
+      <w:lvlText w:val=""/>
+      <w:lvlJc w:val="left"/>
+      <w:pPr>
+        <w:tabs>
+          <w:tab w:val="num" w:pos="5760"/>
+        </w:tabs>
+        <w:ind w:left="5760" w:hanging="360"/>
+      </w:pPr>
+      <w:rPr>
+        <w:rFonts w:ascii="Symbol" w:hAnsi="Symbol" w:hint="default"/>
+        <w:sz w:val="20"/>
+      </w:rPr>
+    </w:lvl>
+    <w:lvl w:ilvl="8" w:tentative="1">
+      <w:start w:val="1"/>
+      <w:numFmt w:val="bullet"/>
+      <w:lvlText w:val=""/>
+      <w:lvlJc w:val="left"/>
+      <w:pPr>
+        <w:tabs>
+          <w:tab w:val="num" w:pos="6480"/>
+        </w:tabs>
+        <w:ind w:left="6480" w:hanging="360"/>
+      </w:pPr>
+      <w:rPr>
+        <w:rFonts w:ascii="Symbol" w:hAnsi="Symbol" w:hint="default"/>
+        <w:sz w:val="20"/>
+      </w:rPr>
+    </w:lvl>
+  </w:abstractNum>
+  <w:abstractNum w:abstractNumId="18" w15:restartNumberingAfterBreak="0">
     <w:nsid w:val="60846F9C"/>
     <w:multiLevelType w:val="multilevel"/>
     <w:tmpl w:val="F3E096E0"/>
@@ -7464,7 +8482,7 @@
       </w:pPr>
     </w:lvl>
   </w:abstractNum>
-  <w:abstractNum w:abstractNumId="15" w15:restartNumberingAfterBreak="0">
+  <w:abstractNum w:abstractNumId="19" w15:restartNumberingAfterBreak="0">
     <w:nsid w:val="62081105"/>
     <w:multiLevelType w:val="multilevel"/>
     <w:tmpl w:val="385A2A5A"/>
@@ -7613,7 +8631,120 @@
       </w:rPr>
     </w:lvl>
   </w:abstractNum>
-  <w:abstractNum w:abstractNumId="16" w15:restartNumberingAfterBreak="0">
+  <w:abstractNum w:abstractNumId="20" w15:restartNumberingAfterBreak="0">
+    <w:nsid w:val="64694DB7"/>
+    <w:multiLevelType w:val="multilevel"/>
+    <w:tmpl w:val="34AC16C4"/>
+    <w:lvl w:ilvl="0">
+      <w:start w:val="1"/>
+      <w:numFmt w:val="decimal"/>
+      <w:lvlText w:val="%1."/>
+      <w:lvlJc w:val="left"/>
+      <w:pPr>
+        <w:tabs>
+          <w:tab w:val="num" w:pos="720"/>
+        </w:tabs>
+        <w:ind w:left="720" w:hanging="360"/>
+      </w:pPr>
+    </w:lvl>
+    <w:lvl w:ilvl="1" w:tentative="1">
+      <w:start w:val="1"/>
+      <w:numFmt w:val="decimal"/>
+      <w:lvlText w:val="%2."/>
+      <w:lvlJc w:val="left"/>
+      <w:pPr>
+        <w:tabs>
+          <w:tab w:val="num" w:pos="1440"/>
+        </w:tabs>
+        <w:ind w:left="1440" w:hanging="360"/>
+      </w:pPr>
+    </w:lvl>
+    <w:lvl w:ilvl="2" w:tentative="1">
+      <w:start w:val="1"/>
+      <w:numFmt w:val="decimal"/>
+      <w:lvlText w:val="%3."/>
+      <w:lvlJc w:val="left"/>
+      <w:pPr>
+        <w:tabs>
+          <w:tab w:val="num" w:pos="2160"/>
+        </w:tabs>
+        <w:ind w:left="2160" w:hanging="360"/>
+      </w:pPr>
+    </w:lvl>
+    <w:lvl w:ilvl="3" w:tentative="1">
+      <w:start w:val="1"/>
+      <w:numFmt w:val="decimal"/>
+      <w:lvlText w:val="%4."/>
+      <w:lvlJc w:val="left"/>
+      <w:pPr>
+        <w:tabs>
+          <w:tab w:val="num" w:pos="2880"/>
+        </w:tabs>
+        <w:ind w:left="2880" w:hanging="360"/>
+      </w:pPr>
+    </w:lvl>
+    <w:lvl w:ilvl="4" w:tentative="1">
+      <w:start w:val="1"/>
+      <w:numFmt w:val="decimal"/>
+      <w:lvlText w:val="%5."/>
+      <w:lvlJc w:val="left"/>
+      <w:pPr>
+        <w:tabs>
+          <w:tab w:val="num" w:pos="3600"/>
+        </w:tabs>
+        <w:ind w:left="3600" w:hanging="360"/>
+      </w:pPr>
+    </w:lvl>
+    <w:lvl w:ilvl="5" w:tentative="1">
+      <w:start w:val="1"/>
+      <w:numFmt w:val="decimal"/>
+      <w:lvlText w:val="%6."/>
+      <w:lvlJc w:val="left"/>
+      <w:pPr>
+        <w:tabs>
+          <w:tab w:val="num" w:pos="4320"/>
+        </w:tabs>
+        <w:ind w:left="4320" w:hanging="360"/>
+      </w:pPr>
+    </w:lvl>
+    <w:lvl w:ilvl="6" w:tentative="1">
+      <w:start w:val="1"/>
+      <w:numFmt w:val="decimal"/>
+      <w:lvlText w:val="%7."/>
+      <w:lvlJc w:val="left"/>
+      <w:pPr>
+        <w:tabs>
+          <w:tab w:val="num" w:pos="5040"/>
+        </w:tabs>
+        <w:ind w:left="5040" w:hanging="360"/>
+      </w:pPr>
+    </w:lvl>
+    <w:lvl w:ilvl="7" w:tentative="1">
+      <w:start w:val="1"/>
+      <w:numFmt w:val="decimal"/>
+      <w:lvlText w:val="%8."/>
+      <w:lvlJc w:val="left"/>
+      <w:pPr>
+        <w:tabs>
+          <w:tab w:val="num" w:pos="5760"/>
+        </w:tabs>
+        <w:ind w:left="5760" w:hanging="360"/>
+      </w:pPr>
+    </w:lvl>
+    <w:lvl w:ilvl="8" w:tentative="1">
+      <w:start w:val="1"/>
+      <w:numFmt w:val="decimal"/>
+      <w:lvlText w:val="%9."/>
+      <w:lvlJc w:val="left"/>
+      <w:pPr>
+        <w:tabs>
+          <w:tab w:val="num" w:pos="6480"/>
+        </w:tabs>
+        <w:ind w:left="6480" w:hanging="360"/>
+      </w:pPr>
+    </w:lvl>
+  </w:abstractNum>
+  <w:abstractNum w:abstractNumId="21" w15:restartNumberingAfterBreak="0">
     <w:nsid w:val="78AF2F88"/>
     <w:multiLevelType w:val="multilevel"/>
     <w:tmpl w:val="810AFA86"/>
@@ -7766,13 +8897,13 @@
     <w:abstractNumId w:val="1"/>
   </w:num>
   <w:num w:numId="2" w16cid:durableId="1384868946">
-    <w:abstractNumId w:val="16"/>
+    <w:abstractNumId w:val="21"/>
   </w:num>
   <w:num w:numId="3" w16cid:durableId="654647873">
     <w:abstractNumId w:val="0"/>
   </w:num>
   <w:num w:numId="4" w16cid:durableId="519512928">
-    <w:abstractNumId w:val="15"/>
+    <w:abstractNumId w:val="19"/>
   </w:num>
   <w:num w:numId="5" w16cid:durableId="713388415">
     <w:abstractNumId w:val="4"/>
@@ -7790,10 +8921,10 @@
     <w:abstractNumId w:val="5"/>
   </w:num>
   <w:num w:numId="10" w16cid:durableId="150676987">
-    <w:abstractNumId w:val="11"/>
+    <w:abstractNumId w:val="12"/>
   </w:num>
   <w:num w:numId="11" w16cid:durableId="1555699914">
-    <w:abstractNumId w:val="12"/>
+    <w:abstractNumId w:val="13"/>
   </w:num>
   <w:num w:numId="12" w16cid:durableId="1609777414">
     <w:abstractNumId w:val="8"/>
@@ -7814,13 +8945,37 @@
     </w:lvlOverride>
   </w:num>
   <w:num w:numId="16" w16cid:durableId="986664105">
-    <w:abstractNumId w:val="14"/>
+    <w:abstractNumId w:val="18"/>
     <w:lvlOverride w:ilvl="0">
       <w:startOverride w:val="1"/>
     </w:lvlOverride>
   </w:num>
   <w:num w:numId="17" w16cid:durableId="1045567947">
-    <w:abstractNumId w:val="13"/>
+    <w:abstractNumId w:val="15"/>
+  </w:num>
+  <w:num w:numId="18" w16cid:durableId="1302155164">
+    <w:abstractNumId w:val="11"/>
+  </w:num>
+  <w:num w:numId="19" w16cid:durableId="1328248091">
+    <w:abstractNumId w:val="17"/>
+  </w:num>
+  <w:num w:numId="20" w16cid:durableId="1875800449">
+    <w:abstractNumId w:val="16"/>
+    <w:lvlOverride w:ilvl="0">
+      <w:startOverride w:val="1"/>
+    </w:lvlOverride>
+  </w:num>
+  <w:num w:numId="21" w16cid:durableId="132911733">
+    <w:abstractNumId w:val="14"/>
+    <w:lvlOverride w:ilvl="0">
+      <w:startOverride w:val="6"/>
+    </w:lvlOverride>
+  </w:num>
+  <w:num w:numId="22" w16cid:durableId="1176848542">
+    <w:abstractNumId w:val="20"/>
+    <w:lvlOverride w:ilvl="0">
+      <w:startOverride w:val="1"/>
+    </w:lvlOverride>
   </w:num>
 </w:numbering>
 </file>
@@ -8805,6 +9960,17 @@
       <w:u w:val="single"/>
     </w:rPr>
   </w:style>
+  <w:style w:type="paragraph" w:styleId="NormalWeb">
+    <w:name w:val="Normal (Web)"/>
+    <w:basedOn w:val="Normal"/>
+    <w:uiPriority w:val="99"/>
+    <w:semiHidden/>
+    <w:unhideWhenUsed/>
+    <w:rsid w:val="006F50AF"/>
+    <w:rPr>
+      <w:rFonts w:ascii="Times New Roman" w:hAnsi="Times New Roman" w:cs="Times New Roman"/>
+    </w:rPr>
+  </w:style>
 </w:styles>
 </file>
 

</xml_diff>